<commit_message>
pake compare with ec
</commit_message>
<xml_diff>
--- a/docs/Disertatie_Matei_Rares_5.docx
+++ b/docs/Disertatie_Matei_Rares_5.docx
@@ -10199,7 +10199,7 @@
           <w:noProof/>
         </w:rPr>
         <w:drawing>
-          <wp:anchor distT="0" distB="0" distL="114300" distR="114300" simplePos="0" relativeHeight="251673600" behindDoc="0" locked="0" layoutInCell="1" allowOverlap="1" wp14:anchorId="5BBC0931" wp14:editId="52EBF957">
+          <wp:anchor distT="0" distB="0" distL="114300" distR="114300" simplePos="0" relativeHeight="251673600" behindDoc="0" locked="0" layoutInCell="1" allowOverlap="1" wp14:anchorId="5BBC0931" wp14:editId="02997FCB">
             <wp:simplePos x="0" y="0"/>
             <wp:positionH relativeFrom="page">
               <wp:posOffset>1304290</wp:posOffset>
@@ -10773,7 +10773,7 @@
         </w:rPr>
         <w:lastRenderedPageBreak/>
         <w:drawing>
-          <wp:anchor distT="0" distB="0" distL="114300" distR="114300" simplePos="0" relativeHeight="251674624" behindDoc="0" locked="0" layoutInCell="1" allowOverlap="1" wp14:anchorId="265ECEC0" wp14:editId="7E7468F8">
+          <wp:anchor distT="0" distB="0" distL="114300" distR="114300" simplePos="0" relativeHeight="251674624" behindDoc="0" locked="0" layoutInCell="1" allowOverlap="1" wp14:anchorId="265ECEC0" wp14:editId="38146CAA">
             <wp:simplePos x="0" y="0"/>
             <wp:positionH relativeFrom="margin">
               <wp:align>center</wp:align>
@@ -18961,15 +18961,85 @@
           <w:color w:val="000000"/>
           <w:lang w:val="ro-RO"/>
         </w:rPr>
-        <w:t xml:space="preserve">Pentru maturizarea sistemului se propun mai multe direcții strategice. Standardizarea derivării secretului prin algoritmi robuști (scrypt cu parametri OWASP sau Argon2), eliminarea mecanismelor de rezervă pentru parametri slabi și implementarea fixării amprentelor criptografice constituie priorități imediate. Pe plan matematic, tranziția către o schemă Schnorr pe curbe eliptice sau explorarea protocoalelor alternative de tip SRP [50], PAKE [51] ori J-PAKE [52] ar eficientiza costurile computaționale. Infrastructura necesită externalizarea stocării sesiunilor către soluții de tip in-memory data store și migrarea stratului de date relațional către platforme robuste. Din perspectiva gestionării jetoanelor, se preconizează trecerea de la semnături simetrice (HS256) către algoritmi asimetrici (RS256 sau ES256), decuplând procesele de emitere de cele de verificare. </w:t>
+        <w:t>Pentru maturizarea sistemului se propun mai multe direcții strategice. Standardizarea derivării secretului prin algoritmi robuști (scrypt cu parametri OWASP sau Argon2), explorarea protocoalelor alternative de tip SRP [50]</w:t>
       </w:r>
       <w:r>
         <w:rPr>
           <w:color w:val="000000"/>
           <w:lang w:val="ro-RO"/>
         </w:rPr>
+        <w:t xml:space="preserve"> sau</w:t>
+      </w:r>
+      <w:r>
+        <w:rPr>
+          <w:color w:val="000000"/>
+          <w:lang w:val="ro-RO"/>
+        </w:rPr>
+        <w:t xml:space="preserve"> J-PAKE [5</w:t>
+      </w:r>
+      <w:r>
+        <w:rPr>
+          <w:color w:val="000000"/>
+          <w:lang w:val="ro-RO"/>
+        </w:rPr>
+        <w:t>1</w:t>
+      </w:r>
+      <w:r>
+        <w:rPr>
+          <w:color w:val="000000"/>
+          <w:lang w:val="ro-RO"/>
+        </w:rPr>
+        <w:t>] ar eficientiza costurile computaționale</w:t>
+      </w:r>
+      <w:r>
+        <w:rPr>
+          <w:color w:val="000000"/>
+          <w:lang w:val="ro-RO"/>
+        </w:rPr>
+        <w:t xml:space="preserve"> iar un interes in criptarea retelei cu algoritmi post quantici </w:t>
+      </w:r>
+      <w:r>
+        <w:rPr>
+          <w:color w:val="000000"/>
+          <w:lang w:val="ro-RO"/>
+        </w:rPr>
+        <w:t>[5</w:t>
+      </w:r>
+      <w:r>
+        <w:rPr>
+          <w:color w:val="000000"/>
+          <w:lang w:val="ro-RO"/>
+        </w:rPr>
+        <w:t>2</w:t>
+      </w:r>
+      <w:r>
+        <w:rPr>
+          <w:color w:val="000000"/>
+          <w:lang w:val="ro-RO"/>
+        </w:rPr>
+        <w:t xml:space="preserve">] </w:t>
+      </w:r>
+      <w:r>
+        <w:rPr>
+          <w:color w:val="000000"/>
+          <w:lang w:val="ro-RO"/>
+        </w:rPr>
+        <w:t>ar ajuta impotriva atacurile de decriptare ulterioara</w:t>
+      </w:r>
+      <w:r>
+        <w:rPr>
+          <w:color w:val="000000"/>
+          <w:lang w:val="ro-RO"/>
+        </w:rPr>
+        <w:t xml:space="preserve">. Infrastructura necesită externalizarea stocării sesiunilor către soluții de tip in-memory data store și migrarea stratului de date relațional către platforme robuste. Din perspectiva gestionării jetoanelor, se preconizează trecerea de la semnături simetrice (HS256) către algoritmi asimetrici (RS256 sau ES256), decuplând procesele de emitere de cele de verificare. Consolidarea perimetrului de securitate presupune integrarea mecanismelor de limitare a ratei de </w:t>
+      </w:r>
+      <w:r>
+        <w:rPr>
+          <w:color w:val="000000"/>
+          <w:lang w:val="ro-RO"/>
+        </w:rPr>
         <w:lastRenderedPageBreak/>
-        <w:t>Consolidarea perimetrului de securitate presupune integrarea mecanismelor de limitare a ratei de acces, jurnalizarea structurată a evenimentelor de securitate, liste de revocare a jetoanelor și restricționarea comunicării exclusiv prin protocolul HTTPS. Pe termen lung, încorporarea jetoanelor de tip proof-of-possession va elimina riscurile modelului bazat pe bearer token.</w:t>
+        <w:t>acces, jurnalizarea structurată a evenimentelor de securitate, liste de revocare a jetoanelor și restricționarea comunicării exclusiv prin protocolul HTTPS. Pe termen lung, încorporarea jetoanelor de tip proof-of-possession va elimina riscurile modelului bazat pe bearer token.</w:t>
       </w:r>
     </w:p>
     <w:p>
@@ -20801,7 +20871,7 @@
           <w:sz w:val="22"/>
           <w:szCs w:val="22"/>
         </w:rPr>
-        <w:t>***, PAKE: Password Authenticated Key Exchange, https://asecuritysite.com/pake, ultima accesare: 30/05/2026.</w:t>
+        <w:t>***, Password Authenticated Key Exchange by Juggling (J-PAKE), Wikipedia, https://en.wikipedia.org/wiki/Password_Authenticated_Key_Exchange_by_Juggling, ultima accesare: 30/05/2026.</w:t>
       </w:r>
     </w:p>
     <w:p>
@@ -20835,7 +20905,7 @@
           <w:sz w:val="22"/>
           <w:szCs w:val="22"/>
         </w:rPr>
-        <w:t>***, Password Authenticated Key Exchange by Juggling (J-PAKE), Wikipedia, https://en.wikipedia.org/wiki/Password_Authenticated_Key_Exchange_by_Juggling, ultima accesare: 30/05/2026.</w:t>
+        <w:t>Konstantina Souvatzidaki, K.; Limniotis, K. Post-Quantum Key Exchange in TLS 1.3: Further Analysis on Performance of New Cryptographic Standards. Cryptography 2025, 9, 73. https://doi.org/10.3390/cryptography9040073</w:t>
       </w:r>
     </w:p>
     <w:p>
@@ -20859,44 +20929,6 @@
           <w:szCs w:val="22"/>
         </w:rPr>
       </w:pPr>
-      <w:r>
-        <w:rPr>
-          <w:color w:val="000000"/>
-          <w:sz w:val="22"/>
-          <w:szCs w:val="22"/>
-        </w:rPr>
-        <w:t>Todo referinte pentru a HNDL si algoritimi anti hndl (j=pake ?)</w:t>
-      </w:r>
-    </w:p>
-    <w:p>
-      <w:pPr>
-        <w:widowControl/>
-        <w:pBdr>
-          <w:top w:val="nil"/>
-          <w:left w:val="nil"/>
-          <w:bottom w:val="nil"/>
-          <w:right w:val="nil"/>
-          <w:between w:val="nil"/>
-        </w:pBdr>
-        <w:tabs>
-          <w:tab w:val="left" w:pos="450"/>
-        </w:tabs>
-        <w:spacing w:after="50"/>
-        <w:jc w:val="both"/>
-        <w:rPr>
-          <w:color w:val="000000"/>
-          <w:sz w:val="22"/>
-          <w:szCs w:val="22"/>
-        </w:rPr>
-      </w:pPr>
-      <w:r>
-        <w:rPr>
-          <w:color w:val="000000"/>
-          <w:sz w:val="22"/>
-          <w:szCs w:val="22"/>
-        </w:rPr>
-        <w:t>https://www.paloaltonetworks.com/cyberpedia/harvest-now-decrypt-later-hndl</w:t>
-      </w:r>
     </w:p>
     <w:p>
       <w:pPr>
@@ -23963,7 +23995,6 @@
   <w:style w:type="character" w:default="1" w:styleId="DefaultParagraphFont">
     <w:name w:val="Default Paragraph Font"/>
     <w:uiPriority w:val="1"/>
-    <w:semiHidden/>
     <w:unhideWhenUsed/>
   </w:style>
   <w:style w:type="table" w:default="1" w:styleId="TableNormal">

</xml_diff>

<commit_message>
adaugare 2048 bit si comparatie srp si spake
</commit_message>
<xml_diff>
--- a/docs/Disertatie_Matei_Rares_5.docx
+++ b/docs/Disertatie_Matei_Rares_5.docx
@@ -4296,7 +4296,25 @@
                 <w:iCs/>
                 <w:noProof/>
               </w:rPr>
-              <w:t>Serverul de autentificare</w:t>
+              <w:t>Serveru</w:t>
+            </w:r>
+            <w:r>
+              <w:rPr>
+                <w:rStyle w:val="Hyperlink"/>
+                <w:i/>
+                <w:iCs/>
+                <w:noProof/>
+              </w:rPr>
+              <w:t>l</w:t>
+            </w:r>
+            <w:r>
+              <w:rPr>
+                <w:rStyle w:val="Hyperlink"/>
+                <w:i/>
+                <w:iCs/>
+                <w:noProof/>
+              </w:rPr>
+              <w:t xml:space="preserve"> de autentificare</w:t>
             </w:r>
             <w:r>
               <w:rPr>
@@ -5580,7 +5598,13 @@
         <w:rPr>
           <w:color w:val="000000"/>
         </w:rPr>
-        <w:t>La final, în secțiunea dedicată concluziilor sunt evidențiate rezultatele obținute prin testarea automatizată și evaluarea de performanță, diverse modalități de îmbunătățire a soluției actuale, urmată de bibliografia care include referințele utilizate.</w:t>
+        <w:t>La final, în secțiunea dedicată concluziilor sunt sintetizate rezultatele obținute prin testarea automatizată și evaluarea comparativă de performanță, sunt identificate limitările soluției actuale și sunt propuse direcții viitoare de dezvoltare, urmată de bibliografi</w:t>
+      </w:r>
+      <w:r>
+        <w:rPr>
+          <w:color w:val="000000"/>
+        </w:rPr>
+        <w:t>e.</w:t>
       </w:r>
     </w:p>
     <w:p>
@@ -5685,7 +5709,7 @@
         <w:rPr>
           <w:color w:val="000000"/>
         </w:rPr>
-        <w:t xml:space="preserve"> GB RAM și un procesor Intel Core Ultra 7 165H   1.40 GHz</w:t>
+        <w:t xml:space="preserve"> GB RAM și un procesor Intel Core Ultra 7 165H  1.40 GHz</w:t>
       </w:r>
     </w:p>
     <w:p>
@@ -6054,7 +6078,31 @@
         <w:rPr>
           <w:color w:val="000000"/>
         </w:rPr>
-        <w:t>ZKP, formalizată inițial de Goldwasser, Micali și Rackoff în lucrarea fundamentală privind complexitatea cunoașterii în sistemele de demonstrații interactive [12], reprezintă un protocol criptografic fundamental prin intermediul căruia o entitate, denumită solicitant (prover / doveditor), poate demonstra unei alte entități, denumită verificator (verifier), veridicitatea unei afirmații sau cunoașterea unui secret, fără a dezvălui nicio informație suplimentară dincolo de simpla atestare a adevărului. Sistemul nu urmărește să afle parola utilizatorului, ci doar să obțină certitudinea matematică a cunoașterii acesteia. Pe lângă aplicabilitatea în autentificarea standard client-server, protocoalele ZKP au devenit instrumente esențiale pentru obținerea Identității Auto-Suverane (Self-Sovereign Identity) [13] și a sistemelor care protejează confidențialitatea, spectrul de utilizare extinzându-se semnificativ în ultimii ani, de la verificarea tranzacțiilor blockchain până la validarea conformității datelor fără divulgarea conținutului [14], [15]. Această paradigmă modernă elimină necesitatea unor entități intermediare de încredere (precum furnizorii de identitate de tip Google Sign-In sau Facebook) pentru atestarea identității, permițând utilizatorului să demonstreze direct și prin rigoare matematică faptul că este eligibil pentru accesarea resurselor, păstrând controlul absolut asupra secretelor sale.</w:t>
+        <w:t>ZKP, formalizată inițial de Goldwasser, Micali și Rackoff în lucrarea fundamentală privind complexitatea cunoașterii în sistemele de demonstrații interactive [12], reprezintă un protocol criptografic fundamental prin intermediul căruia o entitate, denumită solicitant (prover / doveditor), poate demonstra unei alte entități, denumită verificator (verifier), veridicitatea unei afirmații sau cunoașterea unui secret, fără a dezvălui nicio informație suplimentară dincolo de simpla atestare a adevărului. Sistemul nu urmărește să afle parola utilizatorului, ci doar să obțină certitudinea matematică a cunoașterii acesteia. Pe lângă aplicabilitatea în autentificarea standard client-server, protocoalele ZKP au devenit instrumente esențiale pentru obținerea Identității Auto-Suverane (</w:t>
+      </w:r>
+      <w:r>
+        <w:rPr>
+          <w:color w:val="000000"/>
+        </w:rPr>
+        <w:t>„</w:t>
+      </w:r>
+      <w:r>
+        <w:rPr>
+          <w:color w:val="000000"/>
+        </w:rPr>
+        <w:t>Self-Sovereign Identity</w:t>
+      </w:r>
+      <w:r>
+        <w:rPr>
+          <w:color w:val="000000"/>
+        </w:rPr>
+        <w:t>” – engl.</w:t>
+      </w:r>
+      <w:r>
+        <w:rPr>
+          <w:color w:val="000000"/>
+        </w:rPr>
+        <w:t>) [13] și a sistemelor care protejează confidențialitatea, spectrul de utilizare extinzându-se semnificativ în ultimii ani, de la verificarea tranzacțiilor blockchain până la validarea conformității datelor fără divulgarea conținutului [14], [15]. Această paradigmă modernă elimină necesitatea unor entități intermediare de încredere (precum furnizorii de identitate de tip Google Sign-In sau Facebook) pentru atestarea identității, permițând utilizatorului să demonstreze direct și prin rigoare matematică faptul că este eligibil pentru accesarea resurselor, păstrând controlul absolut asupra secretelor sale.</w:t>
       </w:r>
     </w:p>
     <w:p>
@@ -6098,7 +6146,55 @@
         <w:rPr>
           <w:color w:val="000000"/>
         </w:rPr>
-        <w:t>În arhitectura ZKP, rețeaua transportă exclusiv transcrisul unei dovezi (valori matematice efemere), care nu poate fi reutilizat în afara contextului în care a fost generat. Astfel, protocolul oferă o reziliență absolută la atacurile de interceptare a traficului de tip „Store Now, Decrypt Later”  [16], [17], [18]; dacă un adversar observă schimbul de mesaje, acesta va capta doar numere asociate unui proces tranzitoriu, extragerea secretului fiind imposibilă matematic. În al doilea rând, previne atacurile de tip Replay, deoarece natura interactivă a protocolului presupune emiterea unei provocări unice (challenge) de către server la fiecare încercare de conectare. Totodată, atenuează complet impactul breșelor de date (Data Leaks) prin eliminarea „secretului partajat”, serverul stocând exclusiv chei publice care sunt inutile unui atacator în lipsa dispozitivului și a parolei clientului.</w:t>
+        <w:t xml:space="preserve">În arhitectura ZKP, rețeaua transportă exclusiv transcrisul unei dovezi (valori matematice efemere), care nu poate fi reutilizat în afara contextului în care a fost generat. Astfel, protocolul oferă o reziliență absolută la atacurile de interceptare a traficului de tip </w:t>
+      </w:r>
+      <w:r>
+        <w:rPr>
+          <w:color w:val="000000"/>
+        </w:rPr>
+        <w:t>SNDL (</w:t>
+      </w:r>
+      <w:r>
+        <w:rPr>
+          <w:color w:val="000000"/>
+        </w:rPr>
+        <w:t>„Store Now, Decrypt Later”</w:t>
+      </w:r>
+      <w:r>
+        <w:rPr>
+          <w:color w:val="000000"/>
+        </w:rPr>
+        <w:t>)</w:t>
+      </w:r>
+      <w:r>
+        <w:rPr>
+          <w:color w:val="000000"/>
+        </w:rPr>
+        <w:t xml:space="preserve">  [16], [17], [18]; dacă un adversar observă schimbul de mesaje, acesta va capta doar numere asociate unui proces tranzitoriu, extragerea secretului fiind imposibilă matematic. În al doilea rând, previne atacurile de tip Replay, deoarece natura interactivă a protocolului presupune emiterea unei provocări unice (</w:t>
+      </w:r>
+      <w:r>
+        <w:rPr>
+          <w:color w:val="000000"/>
+        </w:rPr>
+        <w:t>„</w:t>
+      </w:r>
+      <w:r>
+        <w:rPr>
+          <w:color w:val="000000"/>
+        </w:rPr>
+        <w:t>challenge</w:t>
+      </w:r>
+      <w:r>
+        <w:rPr>
+          <w:color w:val="000000"/>
+        </w:rPr>
+        <w:t>” – engl.</w:t>
+      </w:r>
+      <w:r>
+        <w:rPr>
+          <w:color w:val="000000"/>
+        </w:rPr>
+        <w:t>) de către server la fiecare încercare de conectare. Totodată, atenuează complet impactul breșelor de date prin eliminarea „secretului partajat”, serverul stocând exclusiv chei publice care sunt inutile unui atacator în lipsa dispozitivului și a parolei clientului.</w:t>
       </w:r>
     </w:p>
     <w:p>
@@ -7034,13 +7130,25 @@
         <w:rPr>
           <w:color w:val="000000"/>
         </w:rPr>
-        <w:t>enerarea provocării ("Challenge" - engl.)</w:t>
-      </w:r>
-      <w:r>
-        <w:rPr>
-          <w:color w:val="000000"/>
-        </w:rPr>
-        <w:t xml:space="preserve"> în care v</w:t>
+        <w:t>enerarea provocării</w:t>
+      </w:r>
+      <w:r>
+        <w:rPr>
+          <w:color w:val="000000"/>
+        </w:rPr>
+        <w:t>,</w:t>
+      </w:r>
+      <w:r>
+        <w:rPr>
+          <w:color w:val="000000"/>
+        </w:rPr>
+        <w:t xml:space="preserve"> </w:t>
+      </w:r>
+      <w:r>
+        <w:rPr>
+          <w:color w:val="000000"/>
+        </w:rPr>
+        <w:t>în care v</w:t>
       </w:r>
       <w:r>
         <w:rPr>
@@ -8867,7 +8975,19 @@
         <w:rPr>
           <w:color w:val="000000"/>
         </w:rPr>
-        <w:t xml:space="preserve">Pentru a asigura o validare criptografică și o integrare cu mecanismele de autorizare delegată, sistemul trebuie să respecte un flux operațional pe mai multe etape. În prima etapă, se execută un pre-schimb al parametrilor publici ("Handshake" - engl.), clientul obține parametrii criptografici globali ai grupului (P, G) printr-un punct terminal dedicat. Această abordare previne atacurile de tip Logjam, astfel, prin utilizarea unor parametri specifici fiecărui server, se evită vulnerabilitatea în fața unui pre-calcul comun (utilizând algoritmi precum Number Field Sieve) realizat de un adversar asupra unui grup standardizat comun. În etapa de înregistrare, clientul generează local perechea de chei și transmite valoarea publică </w:t>
+        <w:t>Pentru a asigura o validare criptografică și o integrare cu mecanismele de autorizare delegată, sistemul trebuie să respecte un flux operațional pe mai multe etape. În prima etapă, se execută un pre-schimb al parametrilor publici ("Handshake" - engl.), clientul obține parametrii criptografici globali ai grupului (P, G) printr-un punct terminal dedicat. Această abordare previne atacurile de tip Logjam</w:t>
+      </w:r>
+      <w:r>
+        <w:rPr>
+          <w:color w:val="000000"/>
+        </w:rPr>
+        <w:t xml:space="preserve"> [54]</w:t>
+      </w:r>
+      <w:r>
+        <w:rPr>
+          <w:color w:val="000000"/>
+        </w:rPr>
+        <w:t xml:space="preserve">, astfel, prin utilizarea unor parametri specifici fiecărui server, se evită vulnerabilitatea în fața unui pre-calcul comun (utilizând algoritmi precum Number Field Sieve) realizat de un adversar asupra unui grup standardizat comun. În etapa de înregistrare, clientul generează local perechea de chei și transmite valoarea publică </w:t>
       </w:r>
       <w:r>
         <w:rPr>
@@ -10201,7 +10321,7 @@
           <w:noProof/>
         </w:rPr>
         <w:drawing>
-          <wp:anchor distT="0" distB="0" distL="114300" distR="114300" simplePos="0" relativeHeight="251673600" behindDoc="0" locked="0" layoutInCell="1" allowOverlap="1" wp14:anchorId="5BBC0931" wp14:editId="0C1297E8">
+          <wp:anchor distT="0" distB="0" distL="114300" distR="114300" simplePos="0" relativeHeight="251673600" behindDoc="0" locked="0" layoutInCell="1" allowOverlap="1" wp14:anchorId="5BBC0931" wp14:editId="3B3A2A03">
             <wp:simplePos x="0" y="0"/>
             <wp:positionH relativeFrom="page">
               <wp:posOffset>1304290</wp:posOffset>
@@ -10775,7 +10895,7 @@
         </w:rPr>
         <w:lastRenderedPageBreak/>
         <w:drawing>
-          <wp:anchor distT="0" distB="0" distL="114300" distR="114300" simplePos="0" relativeHeight="251674624" behindDoc="0" locked="0" layoutInCell="1" allowOverlap="1" wp14:anchorId="265ECEC0" wp14:editId="4A5DD073">
+          <wp:anchor distT="0" distB="0" distL="114300" distR="114300" simplePos="0" relativeHeight="251674624" behindDoc="0" locked="0" layoutInCell="1" allowOverlap="1" wp14:anchorId="265ECEC0" wp14:editId="1BA8F134">
             <wp:simplePos x="0" y="0"/>
             <wp:positionH relativeFrom="margin">
               <wp:align>center</wp:align>
@@ -11620,7 +11740,7 @@
           <w:color w:val="000000"/>
           <w:lang w:val="ro-RO"/>
         </w:rPr>
-        <w:t>/oauth/pkce/ și /oauth/simple/ (POST): Fluxuri de autorizare comparativă (Authorization Code – engl.) [8].</w:t>
+        <w:t>/oauth/pkce/ și /oauth/simple/ (POST): Fluxuri de autorizare comparativă (Authorization Code – engl.).</w:t>
       </w:r>
     </w:p>
     <w:p>
@@ -12043,7 +12163,7 @@
         <w:rPr>
           <w:color w:val="000000"/>
         </w:rPr>
-        <w:t>Fiecare variabilă implicată îndeplinește un rol fundamental în mitigarea vulnerabilităților de rețea. Provocarea generată de server invalidează atacurile de reluare (replay attacks – engl.) impunând o demonstrație temporală unică, în timp ce angajamentul asociază criptografic sesiunea de un element aleatoriu nedezvăluit. Pentru asigurarea standardizării formale, sintaxa se definește prin notația ABNF (Augmented Backus-Naur Form – engl.) [43]:</w:t>
+        <w:t>Fiecare variabilă implicată îndeplinește un rol fundamental în mitigarea vulnerabilităților de rețea. Provocarea generată de server invalidează atacurile de reluare (replay attacks – engl.) impunând o demonstrație temporală unică, în timp ce angajamentul asociază criptografic sesiunea de un element aleatoriu nedezvăluit. Pentru asigurarea standardizării formale, sintaxa se definește prin notația ABNF (Augmented Backus-Naur Form) [43]:</w:t>
       </w:r>
     </w:p>
     <w:p>
@@ -12582,20 +12702,68 @@
         <w:jc w:val="both"/>
         <w:rPr>
           <w:color w:val="000000"/>
-        </w:rPr>
-      </w:pPr>
-      <w:r>
-        <w:rPr>
-          <w:color w:val="000000"/>
-        </w:rPr>
-        <w:t xml:space="preserve">Gestionarea concurenței sesiunilor este delegată structurii _SessionStore, care menține un index invers de la identificatorul de utilizator la identificatorul de sesiune activă. Prin această asociere bidirecțională, serverul detectează situațiile în care un al doilea angajament este inițiat </w:t>
+          <w:sz w:val="22"/>
+          <w:szCs w:val="22"/>
+        </w:rPr>
+      </w:pPr>
+      <w:r>
+        <w:rPr>
+          <w:color w:val="000000"/>
+        </w:rPr>
+        <w:t xml:space="preserve">Dimensiunea grupului criptografic reflectă compromisul dintre securitate și costul computațional al exponențierii modulare. Cel mai recent atac de tip Logjam demonstrat public a vizat un grup de 795 de biți [53], iar recomandările NIST impun minimum 2048 de biți pentru un </w:t>
       </w:r>
       <w:r>
         <w:rPr>
           <w:color w:val="000000"/>
         </w:rPr>
         <w:lastRenderedPageBreak/>
-        <w:t>pentru un utilizator care dispune deja de o sesiune în curs, invalidând-o automat conform politicii de protecție descrise în secțiunea II.1.2.</w:t>
+        <w:t>nivel de securitate adecvat pe termen mediu [54]. În consecință, parametrul P utilizat este numărul prim sigur de 2048 de biți din grupul MODP standardizat prin RFC 3526</w:t>
+      </w:r>
+      <w:r>
+        <w:rPr>
+          <w:color w:val="000000"/>
+        </w:rPr>
+        <w:t xml:space="preserve"> [56]</w:t>
+      </w:r>
+      <w:r>
+        <w:rPr>
+          <w:color w:val="000000"/>
+        </w:rPr>
+        <w:t xml:space="preserve"> și RFC 5054</w:t>
+      </w:r>
+      <w:r>
+        <w:rPr>
+          <w:color w:val="000000"/>
+        </w:rPr>
+        <w:t xml:space="preserve"> [50]</w:t>
+      </w:r>
+      <w:r>
+        <w:rPr>
+          <w:color w:val="000000"/>
+        </w:rPr>
+        <w:t>, cu generatorul G = 4, oferind un nivel de securitate de aproximativ 112 biți. O evoluție naturală ar consta în migrarea către criptografia pe curbe eliptice (Elliptic Curve Cryptography, ECC), care oferă securitate echivalentă cu scalari semnificativ inferiori, reducând latența și volumul datelor transmise; această direcție este consemnată ca obiectiv viitor de dezvoltare.</w:t>
+      </w:r>
+    </w:p>
+    <w:p>
+      <w:pPr>
+        <w:pBdr>
+          <w:top w:val="nil"/>
+          <w:left w:val="nil"/>
+          <w:bottom w:val="nil"/>
+          <w:right w:val="nil"/>
+          <w:between w:val="nil"/>
+        </w:pBdr>
+        <w:ind w:firstLine="720"/>
+        <w:jc w:val="both"/>
+        <w:rPr>
+          <w:color w:val="000000"/>
+        </w:rPr>
+      </w:pPr>
+      <w:r>
+        <w:rPr>
+          <w:color w:val="000000"/>
+        </w:rPr>
+        <w:t>Gestionarea concurenței sesiunilor este delegată structurii _SessionStore, care menține un index invers de la identificatorul de utilizator la identificatorul de sesiune activă. Prin această asociere bidirecțională, serverul detectează situațiile în care un al doilea angajament este inițiat pentru un utilizator care dispune deja de o sesiune în curs, invalidând-o automat conform politicii de protecție descrise în secțiunea II.1.2.</w:t>
       </w:r>
     </w:p>
     <w:p>
@@ -12995,7 +13163,21 @@
           <w:color w:val="000000"/>
           <w:lang w:val="ro-RO"/>
         </w:rPr>
-        <w:t>cadrul procesului de evaluare empirică a sistemului propus, s-a procedat la analiza sistematică a cazurilor pozitive care validează comportamentul corect al platformei pe traseul nominal (happy path). Se observă că înregistrarea unui utilizator nou implică stocarea exclusivă la nivelul serverului a cheii publice definite prin (1), fără a se reține parola în formă brută sau sub aspectul unui rezumat criptografic calculabil, aspect confirmat prin verificarea explicită a faptului că înregistrarea serializată nu conține date în clar sau amprente de tip SHA-256, SHA-512 ori MD5. Fluxul complet de autentificare, structurat pe etapele de angajament și verificare, a fost validat prin generarea de către client a unui element aleatoriu (nonce) notat cu r, determinarea angajamentului (2), recepționarea provocării c și transmiterea dovezii (3) către server. Serverul evaluează ulterior consistența ecuației de verificare ( (4) și (5)), emite un jeton de acces în format JWT și elimină instanța de sesiune pentru a împiedica reutilizarea acesteia, asigurând totodată că accesul la resursele protejate returnează un cod de stare HTTP 200 în prezența unui jeton valid, respectiv un cod HTTP 401 în cazul absenței, expirării sau invalidității acestuia, fapt ce permite funcționarea paralelă și independentă a utilizatorilor multipli fără interferențe la nivelul stării.</w:t>
+        <w:t xml:space="preserve">cadrul procesului de evaluare empirică a sistemului propus, s-a procedat la analiza sistematică a cazurilor pozitive care validează comportamentul corect al platformei pe traseul nominal (happy path). Se observă că înregistrarea unui utilizator nou implică stocarea exclusivă la nivelul serverului a cheii publice definite prin (1), fără a se reține parola în formă brută sau sub aspectul unui rezumat criptografic calculabil, aspect confirmat prin verificarea explicită a faptului că înregistrarea serializată nu conține date în clar sau de </w:t>
+      </w:r>
+      <w:r>
+        <w:rPr>
+          <w:color w:val="000000"/>
+          <w:lang w:val="ro-RO"/>
+        </w:rPr>
+        <w:t>hash</w:t>
+      </w:r>
+      <w:r>
+        <w:rPr>
+          <w:color w:val="000000"/>
+          <w:lang w:val="ro-RO"/>
+        </w:rPr>
+        <w:t>. Fluxul complet de autentificare, structurat pe etapele de angajament și verificare, a fost validat prin generarea de către client a unui element aleatoriu (nonce) notat cu r, determinarea angajamentului (2), recepționarea provocării c și transmiterea dovezii (3) către server. Serverul evaluează ulterior consistența ecuației de verificare ( (4) și (5)), emite un jeton de acces în format JWT și elimină instanța de sesiune pentru a împiedica reutilizarea acesteia, asigurând totodată că accesul la resursele protejate returnează un cod de stare HTTP 200 în prezența unui jeton valid, respectiv un cod HTTP 401 în cazul absenței, expirării sau invalidității acestuia, fapt ce permite funcționarea paralelă și independentă a utilizatorilor multipli fără interferențe la nivelul stării.</w:t>
       </w:r>
     </w:p>
     <w:p>
@@ -13348,12 +13530,12 @@
         <w:tblLook w:val="04A0" w:firstRow="1" w:lastRow="0" w:firstColumn="1" w:lastColumn="0" w:noHBand="0" w:noVBand="1"/>
       </w:tblPr>
       <w:tblGrid>
-        <w:gridCol w:w="3824"/>
-        <w:gridCol w:w="1209"/>
-        <w:gridCol w:w="1001"/>
-        <w:gridCol w:w="1039"/>
-        <w:gridCol w:w="963"/>
-        <w:gridCol w:w="1321"/>
+        <w:gridCol w:w="3813"/>
+        <w:gridCol w:w="1208"/>
+        <w:gridCol w:w="1006"/>
+        <w:gridCol w:w="1043"/>
+        <w:gridCol w:w="968"/>
+        <w:gridCol w:w="1319"/>
       </w:tblGrid>
       <w:tr>
         <w:trPr>
@@ -13602,7 +13784,6 @@
         <w:tc>
           <w:tcPr>
             <w:tcW w:w="0" w:type="auto"/>
-            <w:vAlign w:val="center"/>
             <w:hideMark/>
           </w:tcPr>
           <w:p>
@@ -13621,18 +13802,13 @@
               </w:rPr>
             </w:pPr>
             <w:r>
-              <w:rPr>
-                <w:color w:val="000000"/>
-                <w:lang w:val="ro-RO"/>
-              </w:rPr>
-              <w:t>0,432</w:t>
+              <w:t>15,632</w:t>
             </w:r>
           </w:p>
         </w:tc>
         <w:tc>
           <w:tcPr>
             <w:tcW w:w="0" w:type="auto"/>
-            <w:vAlign w:val="center"/>
             <w:hideMark/>
           </w:tcPr>
           <w:p>
@@ -13651,18 +13827,13 @@
               </w:rPr>
             </w:pPr>
             <w:r>
-              <w:rPr>
-                <w:color w:val="000000"/>
-                <w:lang w:val="ro-RO"/>
-              </w:rPr>
-              <w:t>0,386</w:t>
+              <w:t>14,585</w:t>
             </w:r>
           </w:p>
         </w:tc>
         <w:tc>
           <w:tcPr>
             <w:tcW w:w="0" w:type="auto"/>
-            <w:vAlign w:val="center"/>
             <w:hideMark/>
           </w:tcPr>
           <w:p>
@@ -13681,18 +13852,13 @@
               </w:rPr>
             </w:pPr>
             <w:r>
-              <w:rPr>
-                <w:color w:val="000000"/>
-                <w:lang w:val="ro-RO"/>
-              </w:rPr>
-              <w:t>1,032</w:t>
+              <w:t>18,416</w:t>
             </w:r>
           </w:p>
         </w:tc>
         <w:tc>
           <w:tcPr>
             <w:tcW w:w="0" w:type="auto"/>
-            <w:vAlign w:val="center"/>
             <w:hideMark/>
           </w:tcPr>
           <w:p>
@@ -13711,18 +13877,13 @@
               </w:rPr>
             </w:pPr>
             <w:r>
-              <w:rPr>
-                <w:color w:val="000000"/>
-                <w:lang w:val="ro-RO"/>
-              </w:rPr>
-              <w:t>0,503</w:t>
+              <w:t>16,867</w:t>
             </w:r>
           </w:p>
         </w:tc>
         <w:tc>
           <w:tcPr>
             <w:tcW w:w="0" w:type="auto"/>
-            <w:vAlign w:val="center"/>
             <w:hideMark/>
           </w:tcPr>
           <w:p>
@@ -13741,11 +13902,7 @@
               </w:rPr>
             </w:pPr>
             <w:r>
-              <w:rPr>
-                <w:color w:val="000000"/>
-                <w:lang w:val="ro-RO"/>
-              </w:rPr>
-              <w:t>0,080</w:t>
+              <w:t>0,659</w:t>
             </w:r>
           </w:p>
         </w:tc>
@@ -13787,7 +13944,6 @@
         <w:tc>
           <w:tcPr>
             <w:tcW w:w="0" w:type="auto"/>
-            <w:vAlign w:val="center"/>
             <w:hideMark/>
           </w:tcPr>
           <w:p>
@@ -13806,18 +13962,13 @@
               </w:rPr>
             </w:pPr>
             <w:r>
-              <w:rPr>
-                <w:color w:val="000000"/>
-                <w:lang w:val="ro-RO"/>
-              </w:rPr>
-              <w:t>0,938</w:t>
+              <w:t>34,603</w:t>
             </w:r>
           </w:p>
         </w:tc>
         <w:tc>
           <w:tcPr>
             <w:tcW w:w="0" w:type="auto"/>
-            <w:vAlign w:val="center"/>
             <w:hideMark/>
           </w:tcPr>
           <w:p>
@@ -13836,18 +13987,13 @@
               </w:rPr>
             </w:pPr>
             <w:r>
-              <w:rPr>
-                <w:color w:val="000000"/>
-                <w:lang w:val="ro-RO"/>
-              </w:rPr>
-              <w:t>0,845</w:t>
+              <w:t>32,799</w:t>
             </w:r>
           </w:p>
         </w:tc>
         <w:tc>
           <w:tcPr>
             <w:tcW w:w="0" w:type="auto"/>
-            <w:vAlign w:val="center"/>
             <w:hideMark/>
           </w:tcPr>
           <w:p>
@@ -13866,18 +14012,13 @@
               </w:rPr>
             </w:pPr>
             <w:r>
-              <w:rPr>
-                <w:color w:val="000000"/>
-                <w:lang w:val="ro-RO"/>
-              </w:rPr>
-              <w:t>1,472</w:t>
+              <w:t>41,039</w:t>
             </w:r>
           </w:p>
         </w:tc>
         <w:tc>
           <w:tcPr>
             <w:tcW w:w="0" w:type="auto"/>
-            <w:vAlign w:val="center"/>
             <w:hideMark/>
           </w:tcPr>
           <w:p>
@@ -13896,18 +14037,13 @@
               </w:rPr>
             </w:pPr>
             <w:r>
-              <w:rPr>
-                <w:color w:val="000000"/>
-                <w:lang w:val="ro-RO"/>
-              </w:rPr>
-              <w:t>1,058</w:t>
+              <w:t>38,180</w:t>
             </w:r>
           </w:p>
         </w:tc>
         <w:tc>
           <w:tcPr>
             <w:tcW w:w="0" w:type="auto"/>
-            <w:vAlign w:val="center"/>
             <w:hideMark/>
           </w:tcPr>
           <w:p>
@@ -13926,11 +14062,7 @@
               </w:rPr>
             </w:pPr>
             <w:r>
-              <w:rPr>
-                <w:color w:val="000000"/>
-                <w:lang w:val="ro-RO"/>
-              </w:rPr>
-              <w:t>0,074</w:t>
+              <w:t>1,520</w:t>
             </w:r>
           </w:p>
         </w:tc>
@@ -13972,7 +14104,6 @@
         <w:tc>
           <w:tcPr>
             <w:tcW w:w="0" w:type="auto"/>
-            <w:vAlign w:val="center"/>
             <w:hideMark/>
           </w:tcPr>
           <w:p>
@@ -13991,10 +14122,6 @@
               </w:rPr>
             </w:pPr>
             <w:r>
-              <w:rPr>
-                <w:color w:val="000000"/>
-                <w:lang w:val="ro-RO"/>
-              </w:rPr>
               <w:t>0,004</w:t>
             </w:r>
           </w:p>
@@ -14002,7 +14129,6 @@
         <w:tc>
           <w:tcPr>
             <w:tcW w:w="0" w:type="auto"/>
-            <w:vAlign w:val="center"/>
             <w:hideMark/>
           </w:tcPr>
           <w:p>
@@ -14021,18 +14147,13 @@
               </w:rPr>
             </w:pPr>
             <w:r>
-              <w:rPr>
-                <w:color w:val="000000"/>
-                <w:lang w:val="ro-RO"/>
-              </w:rPr>
-              <w:t>0,003</w:t>
+              <w:t>0,002</w:t>
             </w:r>
           </w:p>
         </w:tc>
         <w:tc>
           <w:tcPr>
             <w:tcW w:w="0" w:type="auto"/>
-            <w:vAlign w:val="center"/>
             <w:hideMark/>
           </w:tcPr>
           <w:p>
@@ -14051,18 +14172,13 @@
               </w:rPr>
             </w:pPr>
             <w:r>
-              <w:rPr>
-                <w:color w:val="000000"/>
-                <w:lang w:val="ro-RO"/>
-              </w:rPr>
-              <w:t>0,029</w:t>
+              <w:t>0,031</w:t>
             </w:r>
           </w:p>
         </w:tc>
         <w:tc>
           <w:tcPr>
             <w:tcW w:w="0" w:type="auto"/>
-            <w:vAlign w:val="center"/>
             <w:hideMark/>
           </w:tcPr>
           <w:p>
@@ -14081,18 +14197,13 @@
               </w:rPr>
             </w:pPr>
             <w:r>
-              <w:rPr>
-                <w:color w:val="000000"/>
-                <w:lang w:val="ro-RO"/>
-              </w:rPr>
-              <w:t>0,004</w:t>
+              <w:t>0,010</w:t>
             </w:r>
           </w:p>
         </w:tc>
         <w:tc>
           <w:tcPr>
             <w:tcW w:w="0" w:type="auto"/>
-            <w:vAlign w:val="center"/>
             <w:hideMark/>
           </w:tcPr>
           <w:p>
@@ -14111,10 +14222,6 @@
               </w:rPr>
             </w:pPr>
             <w:r>
-              <w:rPr>
-                <w:color w:val="000000"/>
-                <w:lang w:val="ro-RO"/>
-              </w:rPr>
               <w:t>0,004</w:t>
             </w:r>
           </w:p>
@@ -14157,7 +14264,6 @@
         <w:tc>
           <w:tcPr>
             <w:tcW w:w="0" w:type="auto"/>
-            <w:vAlign w:val="center"/>
             <w:hideMark/>
           </w:tcPr>
           <w:p>
@@ -14176,10 +14282,6 @@
               </w:rPr>
             </w:pPr>
             <w:r>
-              <w:rPr>
-                <w:color w:val="000000"/>
-                <w:lang w:val="ro-RO"/>
-              </w:rPr>
               <w:t>0,002</w:t>
             </w:r>
           </w:p>
@@ -14187,7 +14289,6 @@
         <w:tc>
           <w:tcPr>
             <w:tcW w:w="0" w:type="auto"/>
-            <w:vAlign w:val="center"/>
             <w:hideMark/>
           </w:tcPr>
           <w:p>
@@ -14206,10 +14307,6 @@
               </w:rPr>
             </w:pPr>
             <w:r>
-              <w:rPr>
-                <w:color w:val="000000"/>
-                <w:lang w:val="ro-RO"/>
-              </w:rPr>
               <w:t>0,002</w:t>
             </w:r>
           </w:p>
@@ -14217,7 +14314,6 @@
         <w:tc>
           <w:tcPr>
             <w:tcW w:w="0" w:type="auto"/>
-            <w:vAlign w:val="center"/>
             <w:hideMark/>
           </w:tcPr>
           <w:p>
@@ -14236,18 +14332,13 @@
               </w:rPr>
             </w:pPr>
             <w:r>
-              <w:rPr>
-                <w:color w:val="000000"/>
-                <w:lang w:val="ro-RO"/>
-              </w:rPr>
-              <w:t>0,017</w:t>
+              <w:t>0,010</w:t>
             </w:r>
           </w:p>
         </w:tc>
         <w:tc>
           <w:tcPr>
             <w:tcW w:w="0" w:type="auto"/>
-            <w:vAlign w:val="center"/>
             <w:hideMark/>
           </w:tcPr>
           <w:p>
@@ -14266,10 +14357,6 @@
               </w:rPr>
             </w:pPr>
             <w:r>
-              <w:rPr>
-                <w:color w:val="000000"/>
-                <w:lang w:val="ro-RO"/>
-              </w:rPr>
               <w:t>0,002</w:t>
             </w:r>
           </w:p>
@@ -14277,7 +14364,6 @@
         <w:tc>
           <w:tcPr>
             <w:tcW w:w="0" w:type="auto"/>
-            <w:vAlign w:val="center"/>
             <w:hideMark/>
           </w:tcPr>
           <w:p>
@@ -14296,10 +14382,6 @@
               </w:rPr>
             </w:pPr>
             <w:r>
-              <w:rPr>
-                <w:color w:val="000000"/>
-                <w:lang w:val="ro-RO"/>
-              </w:rPr>
               <w:t>0,001</w:t>
             </w:r>
           </w:p>
@@ -14588,12 +14670,12 @@
         <w:tblLook w:val="04A0" w:firstRow="1" w:lastRow="0" w:firstColumn="1" w:lastColumn="0" w:noHBand="0" w:noVBand="1"/>
       </w:tblPr>
       <w:tblGrid>
-        <w:gridCol w:w="3881"/>
-        <w:gridCol w:w="1189"/>
-        <w:gridCol w:w="985"/>
-        <w:gridCol w:w="1032"/>
-        <w:gridCol w:w="949"/>
-        <w:gridCol w:w="1311"/>
+        <w:gridCol w:w="3868"/>
+        <w:gridCol w:w="1188"/>
+        <w:gridCol w:w="994"/>
+        <w:gridCol w:w="1031"/>
+        <w:gridCol w:w="958"/>
+        <w:gridCol w:w="1308"/>
       </w:tblGrid>
       <w:tr>
         <w:trPr>
@@ -14842,7 +14924,6 @@
         <w:tc>
           <w:tcPr>
             <w:tcW w:w="0" w:type="auto"/>
-            <w:vAlign w:val="center"/>
             <w:hideMark/>
           </w:tcPr>
           <w:p>
@@ -14861,18 +14942,13 @@
               </w:rPr>
             </w:pPr>
             <w:r>
-              <w:rPr>
-                <w:color w:val="000000"/>
-                <w:lang w:val="ro-RO"/>
-              </w:rPr>
-              <w:t>0,499</w:t>
+              <w:t>17,913</w:t>
             </w:r>
           </w:p>
         </w:tc>
         <w:tc>
           <w:tcPr>
             <w:tcW w:w="0" w:type="auto"/>
-            <w:vAlign w:val="center"/>
             <w:hideMark/>
           </w:tcPr>
           <w:p>
@@ -14891,18 +14967,13 @@
               </w:rPr>
             </w:pPr>
             <w:r>
-              <w:rPr>
-                <w:color w:val="000000"/>
-                <w:lang w:val="ro-RO"/>
-              </w:rPr>
-              <w:t>0,438</w:t>
+              <w:t>16,409</w:t>
             </w:r>
           </w:p>
         </w:tc>
         <w:tc>
           <w:tcPr>
             <w:tcW w:w="0" w:type="auto"/>
-            <w:vAlign w:val="center"/>
             <w:hideMark/>
           </w:tcPr>
           <w:p>
@@ -14921,18 +14992,13 @@
               </w:rPr>
             </w:pPr>
             <w:r>
-              <w:rPr>
-                <w:color w:val="000000"/>
-                <w:lang w:val="ro-RO"/>
-              </w:rPr>
-              <w:t>0,868</w:t>
+              <w:t>21,356</w:t>
             </w:r>
           </w:p>
         </w:tc>
         <w:tc>
           <w:tcPr>
             <w:tcW w:w="0" w:type="auto"/>
-            <w:vAlign w:val="center"/>
             <w:hideMark/>
           </w:tcPr>
           <w:p>
@@ -14951,18 +15017,13 @@
               </w:rPr>
             </w:pPr>
             <w:r>
-              <w:rPr>
-                <w:color w:val="000000"/>
-                <w:lang w:val="ro-RO"/>
-              </w:rPr>
-              <w:t>0,625</w:t>
+              <w:t>20,165</w:t>
             </w:r>
           </w:p>
         </w:tc>
         <w:tc>
           <w:tcPr>
             <w:tcW w:w="0" w:type="auto"/>
-            <w:vAlign w:val="center"/>
             <w:hideMark/>
           </w:tcPr>
           <w:p>
@@ -14981,11 +15042,7 @@
               </w:rPr>
             </w:pPr>
             <w:r>
-              <w:rPr>
-                <w:color w:val="000000"/>
-                <w:lang w:val="ro-RO"/>
-              </w:rPr>
-              <w:t>0,063</w:t>
+              <w:t>1,013</w:t>
             </w:r>
           </w:p>
         </w:tc>
@@ -15583,7 +15640,6 @@
         <w:tc>
           <w:tcPr>
             <w:tcW w:w="0" w:type="auto"/>
-            <w:vAlign w:val="center"/>
             <w:hideMark/>
           </w:tcPr>
           <w:p>
@@ -15602,18 +15658,13 @@
               </w:rPr>
             </w:pPr>
             <w:r>
-              <w:rPr>
-                <w:color w:val="000000"/>
-                <w:lang w:val="ro-RO"/>
-              </w:rPr>
-              <w:t>0,247</w:t>
+              <w:t>0,232</w:t>
             </w:r>
           </w:p>
         </w:tc>
         <w:tc>
           <w:tcPr>
             <w:tcW w:w="0" w:type="auto"/>
-            <w:vAlign w:val="center"/>
             <w:hideMark/>
           </w:tcPr>
           <w:p>
@@ -15632,18 +15683,13 @@
               </w:rPr>
             </w:pPr>
             <w:r>
-              <w:rPr>
-                <w:color w:val="000000"/>
-                <w:lang w:val="ro-RO"/>
-              </w:rPr>
-              <w:t>0,195</w:t>
+              <w:t>0,188</w:t>
             </w:r>
           </w:p>
         </w:tc>
         <w:tc>
           <w:tcPr>
             <w:tcW w:w="0" w:type="auto"/>
-            <w:vAlign w:val="center"/>
             <w:hideMark/>
           </w:tcPr>
           <w:p>
@@ -15662,18 +15708,13 @@
               </w:rPr>
             </w:pPr>
             <w:r>
-              <w:rPr>
-                <w:color w:val="000000"/>
-                <w:lang w:val="ro-RO"/>
-              </w:rPr>
-              <w:t>0,856</w:t>
+              <w:t>0,859</w:t>
             </w:r>
           </w:p>
         </w:tc>
         <w:tc>
           <w:tcPr>
             <w:tcW w:w="0" w:type="auto"/>
-            <w:vAlign w:val="center"/>
             <w:hideMark/>
           </w:tcPr>
           <w:p>
@@ -15692,18 +15733,13 @@
               </w:rPr>
             </w:pPr>
             <w:r>
-              <w:rPr>
-                <w:color w:val="000000"/>
-                <w:lang w:val="ro-RO"/>
-              </w:rPr>
-              <w:t>0,497</w:t>
+              <w:t>0,441</w:t>
             </w:r>
           </w:p>
         </w:tc>
         <w:tc>
           <w:tcPr>
             <w:tcW w:w="0" w:type="auto"/>
-            <w:vAlign w:val="center"/>
             <w:hideMark/>
           </w:tcPr>
           <w:p>
@@ -15722,11 +15758,7 @@
               </w:rPr>
             </w:pPr>
             <w:r>
-              <w:rPr>
-                <w:color w:val="000000"/>
-                <w:lang w:val="ro-RO"/>
-              </w:rPr>
-              <w:t>0,100</w:t>
+              <w:t>0,098</w:t>
             </w:r>
           </w:p>
         </w:tc>
@@ -15768,7 +15800,6 @@
         <w:tc>
           <w:tcPr>
             <w:tcW w:w="0" w:type="auto"/>
-            <w:vAlign w:val="center"/>
             <w:hideMark/>
           </w:tcPr>
           <w:p>
@@ -15787,18 +15818,13 @@
               </w:rPr>
             </w:pPr>
             <w:r>
-              <w:rPr>
-                <w:color w:val="000000"/>
-                <w:lang w:val="ro-RO"/>
-              </w:rPr>
-              <w:t>1,458</w:t>
+              <w:t>20,313</w:t>
             </w:r>
           </w:p>
         </w:tc>
         <w:tc>
           <w:tcPr>
             <w:tcW w:w="0" w:type="auto"/>
-            <w:vAlign w:val="center"/>
             <w:hideMark/>
           </w:tcPr>
           <w:p>
@@ -15817,18 +15843,13 @@
               </w:rPr>
             </w:pPr>
             <w:r>
-              <w:rPr>
-                <w:color w:val="000000"/>
-                <w:lang w:val="ro-RO"/>
-              </w:rPr>
-              <w:t>1,126</w:t>
+              <w:t>18,710</w:t>
             </w:r>
           </w:p>
         </w:tc>
         <w:tc>
           <w:tcPr>
             <w:tcW w:w="0" w:type="auto"/>
-            <w:vAlign w:val="center"/>
             <w:hideMark/>
           </w:tcPr>
           <w:p>
@@ -15847,18 +15868,13 @@
               </w:rPr>
             </w:pPr>
             <w:r>
-              <w:rPr>
-                <w:color w:val="000000"/>
-                <w:lang w:val="ro-RO"/>
-              </w:rPr>
-              <w:t>11,175</w:t>
+              <w:t>31,394</w:t>
             </w:r>
           </w:p>
         </w:tc>
         <w:tc>
           <w:tcPr>
             <w:tcW w:w="0" w:type="auto"/>
-            <w:vAlign w:val="center"/>
             <w:hideMark/>
           </w:tcPr>
           <w:p>
@@ -15877,18 +15893,13 @@
               </w:rPr>
             </w:pPr>
             <w:r>
-              <w:rPr>
-                <w:color w:val="000000"/>
-                <w:lang w:val="ro-RO"/>
-              </w:rPr>
-              <w:t>1,786</w:t>
+              <w:t>22,399</w:t>
             </w:r>
           </w:p>
         </w:tc>
         <w:tc>
           <w:tcPr>
             <w:tcW w:w="0" w:type="auto"/>
-            <w:vAlign w:val="center"/>
             <w:hideMark/>
           </w:tcPr>
           <w:p>
@@ -15907,11 +15918,7 @@
               </w:rPr>
             </w:pPr>
             <w:r>
-              <w:rPr>
-                <w:color w:val="000000"/>
-                <w:lang w:val="ro-RO"/>
-              </w:rPr>
-              <w:t>1,001</w:t>
+              <w:t>1,461</w:t>
             </w:r>
           </w:p>
         </w:tc>
@@ -16321,7 +16328,13 @@
         <w:rPr>
           <w:color w:val="000000"/>
         </w:rPr>
-        <w:t>Se constată că operația criptografică secundară dominantă este validarea apartenenței la subgrup (0,499 ms), care asigură protecția împotriva atacurilor bazate pe subgrupuri mici. Funcțiile auxiliare, precum derivarea parametrului de legare a sesiunii (0,002 ms) sau generarea provocării matematice (0,001 ms), presupun eforturi computaționale neglijabile, în timp ce procesul final de emitere a jetonului JWT (0,020 ms) reprezintă o fracțiune minimală din costul total de procesare. Punctele terminale convenționale ale aplicației (GET /parameters, POST /register, GET /data, POST /data) prezintă latențe cuprinse între 0,25 ms și 1,46 ms, cu valori maximale ocazionale atribuibile presiunii garbage collector-ului sau accesului la baza de date SQLite.</w:t>
+        <w:t>Se constată că operația criptografică secundară dominantă este validarea apartenenței la subgrup (17,913 ms), care asigură protecția împotriva atacurilor bazate pe subgrupuri mici. Funcțiile auxiliare, precum derivarea parametrului de legare a sesiunii (0,002 ms) sau generarea provocării matematice (0,001 ms), presupun eforturi computaționale neglijabile, în timp ce procesul final de emitere a jetonului JWT (0,017 ms) reprezintă o fracțiune minimală din costul total de procesare. Punctele terminale convenționale ale aplicației (GET /parameters, POST /register, GET /data, POST /data) prezintă latențe cuprinse între 0,23 ms și 20,31 ms, cu valori maximale ocazionale atribuibile presiunii garbage collector-ului sau accesului la baza de date SQLite, costul dominant al punctului terminal POST /register fiind determinat de invocarea funcției is_subgroup_member asupra cheii publice recepționate</w:t>
+      </w:r>
+      <w:r>
+        <w:rPr>
+          <w:color w:val="000000"/>
+        </w:rPr>
+        <w:t>.</w:t>
       </w:r>
     </w:p>
     <w:p>
@@ -16343,14 +16356,14 @@
         <w:rPr>
           <w:color w:val="000000"/>
         </w:rPr>
-        <w:t xml:space="preserve">Complementar evaluării operațiilor izolate, s-a procedat la măsurarea latenței complete a fluxurilor de autentificare de la un capăt la altul (end-to-end), înglobând toate etapele protocolare necesare unei autentificări reușite. Rezultatele, sintetizate în Tabelul 3, reflectă costul integral </w:t>
+        <w:t xml:space="preserve">Complementar evaluării operațiilor izolate, s-a procedat la măsurarea latenței complete a </w:t>
       </w:r>
       <w:r>
         <w:rPr>
           <w:color w:val="000000"/>
         </w:rPr>
         <w:lastRenderedPageBreak/>
-        <w:t>perceput de un client care parcurge întreg ciclul de autentificare:</w:t>
+        <w:t>fluxurilor de autentificare de la un capăt la altul (end-to-end), înglobând toate etapele protocolare necesare unei autentificări reușite. Rezultatele, sintetizate în Tabelul 3, reflectă costul integral perceput de un client care parcurge întreg ciclul de autentificare:</w:t>
       </w:r>
     </w:p>
     <w:p>
@@ -16658,7 +16671,6 @@
         <w:tc>
           <w:tcPr>
             <w:tcW w:w="0" w:type="auto"/>
-            <w:vAlign w:val="center"/>
             <w:hideMark/>
           </w:tcPr>
           <w:p>
@@ -16677,18 +16689,13 @@
               </w:rPr>
             </w:pPr>
             <w:r>
-              <w:rPr>
-                <w:color w:val="000000"/>
-                <w:lang w:val="ro-RO"/>
-              </w:rPr>
-              <w:t>3,966</w:t>
+              <w:t>57,578</w:t>
             </w:r>
           </w:p>
         </w:tc>
         <w:tc>
           <w:tcPr>
             <w:tcW w:w="0" w:type="auto"/>
-            <w:vAlign w:val="center"/>
             <w:hideMark/>
           </w:tcPr>
           <w:p>
@@ -16707,18 +16714,13 @@
               </w:rPr>
             </w:pPr>
             <w:r>
-              <w:rPr>
-                <w:color w:val="000000"/>
-                <w:lang w:val="ro-RO"/>
-              </w:rPr>
-              <w:t>3,264</w:t>
+              <w:t>52,966</w:t>
             </w:r>
           </w:p>
         </w:tc>
         <w:tc>
           <w:tcPr>
             <w:tcW w:w="0" w:type="auto"/>
-            <w:vAlign w:val="center"/>
             <w:hideMark/>
           </w:tcPr>
           <w:p>
@@ -16737,18 +16739,13 @@
               </w:rPr>
             </w:pPr>
             <w:r>
-              <w:rPr>
-                <w:color w:val="000000"/>
-                <w:lang w:val="ro-RO"/>
-              </w:rPr>
-              <w:t>14,086</w:t>
+              <w:t>75,769</w:t>
             </w:r>
           </w:p>
         </w:tc>
         <w:tc>
           <w:tcPr>
             <w:tcW w:w="0" w:type="auto"/>
-            <w:vAlign w:val="center"/>
             <w:hideMark/>
           </w:tcPr>
           <w:p>
@@ -16767,11 +16764,7 @@
               </w:rPr>
             </w:pPr>
             <w:r>
-              <w:rPr>
-                <w:color w:val="000000"/>
-                <w:lang w:val="ro-RO"/>
-              </w:rPr>
-              <w:t>4,605</w:t>
+              <w:t>74,073</w:t>
             </w:r>
           </w:p>
         </w:tc>
@@ -16828,7 +16821,6 @@
         <w:tc>
           <w:tcPr>
             <w:tcW w:w="0" w:type="auto"/>
-            <w:vAlign w:val="center"/>
             <w:hideMark/>
           </w:tcPr>
           <w:p>
@@ -16847,18 +16839,13 @@
               </w:rPr>
             </w:pPr>
             <w:r>
-              <w:rPr>
-                <w:color w:val="000000"/>
-                <w:lang w:val="ro-RO"/>
-              </w:rPr>
-              <w:t>0,558</w:t>
+              <w:t>1,046</w:t>
             </w:r>
           </w:p>
         </w:tc>
         <w:tc>
           <w:tcPr>
             <w:tcW w:w="0" w:type="auto"/>
-            <w:vAlign w:val="center"/>
             <w:hideMark/>
           </w:tcPr>
           <w:p>
@@ -16877,18 +16864,13 @@
               </w:rPr>
             </w:pPr>
             <w:r>
-              <w:rPr>
-                <w:color w:val="000000"/>
-                <w:lang w:val="ro-RO"/>
-              </w:rPr>
-              <w:t>0,471</w:t>
+              <w:t>0,852</w:t>
             </w:r>
           </w:p>
         </w:tc>
         <w:tc>
           <w:tcPr>
             <w:tcW w:w="0" w:type="auto"/>
-            <w:vAlign w:val="center"/>
             <w:hideMark/>
           </w:tcPr>
           <w:p>
@@ -16907,18 +16889,13 @@
               </w:rPr>
             </w:pPr>
             <w:r>
-              <w:rPr>
-                <w:color w:val="000000"/>
-                <w:lang w:val="ro-RO"/>
-              </w:rPr>
-              <w:t>1,509</w:t>
+              <w:t>2,168</w:t>
             </w:r>
           </w:p>
         </w:tc>
         <w:tc>
           <w:tcPr>
             <w:tcW w:w="0" w:type="auto"/>
-            <w:vAlign w:val="center"/>
             <w:hideMark/>
           </w:tcPr>
           <w:p>
@@ -16937,11 +16914,7 @@
               </w:rPr>
             </w:pPr>
             <w:r>
-              <w:rPr>
-                <w:color w:val="000000"/>
-                <w:lang w:val="ro-RO"/>
-              </w:rPr>
-              <w:t>0,799</w:t>
+              <w:t>1,576</w:t>
             </w:r>
           </w:p>
         </w:tc>
@@ -16998,7 +16971,6 @@
         <w:tc>
           <w:tcPr>
             <w:tcW w:w="0" w:type="auto"/>
-            <w:vAlign w:val="center"/>
             <w:hideMark/>
           </w:tcPr>
           <w:p>
@@ -17017,18 +16989,13 @@
               </w:rPr>
             </w:pPr>
             <w:r>
-              <w:rPr>
-                <w:color w:val="000000"/>
-                <w:lang w:val="ro-RO"/>
-              </w:rPr>
-              <w:t>0,599</w:t>
+              <w:t>1,011</w:t>
             </w:r>
           </w:p>
         </w:tc>
         <w:tc>
           <w:tcPr>
             <w:tcW w:w="0" w:type="auto"/>
-            <w:vAlign w:val="center"/>
             <w:hideMark/>
           </w:tcPr>
           <w:p>
@@ -17047,18 +17014,13 @@
               </w:rPr>
             </w:pPr>
             <w:r>
-              <w:rPr>
-                <w:color w:val="000000"/>
-                <w:lang w:val="ro-RO"/>
-              </w:rPr>
-              <w:t>0,476</w:t>
+              <w:t>0,850</w:t>
             </w:r>
           </w:p>
         </w:tc>
         <w:tc>
           <w:tcPr>
             <w:tcW w:w="0" w:type="auto"/>
-            <w:vAlign w:val="center"/>
             <w:hideMark/>
           </w:tcPr>
           <w:p>
@@ -17077,18 +17039,13 @@
               </w:rPr>
             </w:pPr>
             <w:r>
-              <w:rPr>
-                <w:color w:val="000000"/>
-                <w:lang w:val="ro-RO"/>
-              </w:rPr>
-              <w:t>1,885</w:t>
+              <w:t>2,714</w:t>
             </w:r>
           </w:p>
         </w:tc>
         <w:tc>
           <w:tcPr>
             <w:tcW w:w="0" w:type="auto"/>
-            <w:vAlign w:val="center"/>
             <w:hideMark/>
           </w:tcPr>
           <w:p>
@@ -17107,11 +17064,7 @@
               </w:rPr>
             </w:pPr>
             <w:r>
-              <w:rPr>
-                <w:color w:val="000000"/>
-                <w:lang w:val="ro-RO"/>
-              </w:rPr>
-              <w:t>0,944</w:t>
+              <w:t>1,591</w:t>
             </w:r>
           </w:p>
         </w:tc>
@@ -17154,7 +17107,6 @@
         <w:tc>
           <w:tcPr>
             <w:tcW w:w="0" w:type="auto"/>
-            <w:vAlign w:val="center"/>
             <w:hideMark/>
           </w:tcPr>
           <w:p>
@@ -17173,18 +17125,13 @@
               </w:rPr>
             </w:pPr>
             <w:r>
-              <w:rPr>
-                <w:color w:val="000000"/>
-                <w:lang w:val="ro-RO"/>
-              </w:rPr>
-              <w:t>0,889</w:t>
+              <w:t>0,869</w:t>
             </w:r>
           </w:p>
         </w:tc>
         <w:tc>
           <w:tcPr>
             <w:tcW w:w="0" w:type="auto"/>
-            <w:vAlign w:val="center"/>
             <w:hideMark/>
           </w:tcPr>
           <w:p>
@@ -17203,18 +17150,13 @@
               </w:rPr>
             </w:pPr>
             <w:r>
-              <w:rPr>
-                <w:color w:val="000000"/>
-                <w:lang w:val="ro-RO"/>
-              </w:rPr>
-              <w:t>0,771</w:t>
+              <w:t>0,752</w:t>
             </w:r>
           </w:p>
         </w:tc>
         <w:tc>
           <w:tcPr>
             <w:tcW w:w="0" w:type="auto"/>
-            <w:vAlign w:val="center"/>
             <w:hideMark/>
           </w:tcPr>
           <w:p>
@@ -17233,18 +17175,13 @@
               </w:rPr>
             </w:pPr>
             <w:r>
-              <w:rPr>
-                <w:color w:val="000000"/>
-                <w:lang w:val="ro-RO"/>
-              </w:rPr>
-              <w:t>1,448</w:t>
+              <w:t>1,838</w:t>
             </w:r>
           </w:p>
         </w:tc>
         <w:tc>
           <w:tcPr>
             <w:tcW w:w="0" w:type="auto"/>
-            <w:vAlign w:val="center"/>
             <w:hideMark/>
           </w:tcPr>
           <w:p>
@@ -17263,11 +17200,7 @@
               </w:rPr>
             </w:pPr>
             <w:r>
-              <w:rPr>
-                <w:color w:val="000000"/>
-                <w:lang w:val="ro-RO"/>
-              </w:rPr>
-              <w:t>1,231</w:t>
+              <w:t>1,404</w:t>
             </w:r>
           </w:p>
         </w:tc>
@@ -17308,7 +17241,7 @@
         <w:rPr>
           <w:color w:val="000000"/>
         </w:rPr>
-        <w:t>Fluxul ZKP complet, cuprinzând cele două runde protocolare (commit și verify), înregistrează o latență medie de 3,97 ms, valoare de aproximativ 5 până la 7 ori superioară celei aferente fluxurilor OAuth 2.0. Descompunerea pe etape a ciclului ZKP la nivelul serverului relevă o contribuție de 1,38 ms pentru faza de angajament (commit) și de 2,16 ms pentru faza de verificare (verify), cu un timp total de parcurgere dus-întors (round-trip) de 3,56 ms. Diferența față de media end-to-end de 3,97 ms este atribuibilă overhead-ului de serializare și deserializare a corpurilor JSON la nivelul clientului de testare.</w:t>
+        <w:t>Fluxul ZKP complet, cuprinzând cele două runde protocolare (commit și verify), înregistrează o latență medie de 57,58 ms, valoare de aproximativ 55 până la 66 de ori superioară celei aferente fluxurilor OAuth 2.0. Descompunerea pe etape a ciclului ZKP la nivelul serverului relevă o contribuție de 21,97 ms pentru faza de angajament (commit) și de 23,26 ms pentru faza de verificare (verify), cu un timp total de parcurgere dus-întors (round-trip) de 45,26 ms. Diferența față de media end-to-end de 57,58 ms este atribuibilă overhead-ului de serializare și deserializare a corpurilor JSON la nivelul clientului de testare.</w:t>
       </w:r>
     </w:p>
     <w:p>
@@ -17618,6 +17551,689 @@
         <w:tc>
           <w:tcPr>
             <w:tcW w:w="0" w:type="auto"/>
+            <w:hideMark/>
+          </w:tcPr>
+          <w:p>
+            <w:pPr>
+              <w:pBdr>
+                <w:top w:val="nil"/>
+                <w:left w:val="nil"/>
+                <w:bottom w:val="nil"/>
+                <w:right w:val="nil"/>
+                <w:between w:val="nil"/>
+              </w:pBdr>
+              <w:jc w:val="both"/>
+              <w:rPr>
+                <w:color w:val="000000"/>
+                <w:lang w:val="ro-RO"/>
+              </w:rPr>
+            </w:pPr>
+            <w:r>
+              <w:t>10</w:t>
+            </w:r>
+          </w:p>
+        </w:tc>
+        <w:tc>
+          <w:tcPr>
+            <w:tcW w:w="0" w:type="auto"/>
+            <w:hideMark/>
+          </w:tcPr>
+          <w:p>
+            <w:pPr>
+              <w:pBdr>
+                <w:top w:val="nil"/>
+                <w:left w:val="nil"/>
+                <w:bottom w:val="nil"/>
+                <w:right w:val="nil"/>
+                <w:between w:val="nil"/>
+              </w:pBdr>
+              <w:jc w:val="both"/>
+              <w:rPr>
+                <w:color w:val="000000"/>
+                <w:lang w:val="ro-RO"/>
+              </w:rPr>
+            </w:pPr>
+            <w:r>
+              <w:t>17,46</w:t>
+            </w:r>
+          </w:p>
+        </w:tc>
+        <w:tc>
+          <w:tcPr>
+            <w:tcW w:w="0" w:type="auto"/>
+            <w:hideMark/>
+          </w:tcPr>
+          <w:p>
+            <w:pPr>
+              <w:pBdr>
+                <w:top w:val="nil"/>
+                <w:left w:val="nil"/>
+                <w:bottom w:val="nil"/>
+                <w:right w:val="nil"/>
+                <w:between w:val="nil"/>
+              </w:pBdr>
+              <w:jc w:val="both"/>
+              <w:rPr>
+                <w:color w:val="000000"/>
+                <w:lang w:val="ro-RO"/>
+              </w:rPr>
+            </w:pPr>
+            <w:r>
+              <w:t>877,54</w:t>
+            </w:r>
+          </w:p>
+        </w:tc>
+        <w:tc>
+          <w:tcPr>
+            <w:tcW w:w="0" w:type="auto"/>
+            <w:hideMark/>
+          </w:tcPr>
+          <w:p>
+            <w:pPr>
+              <w:pBdr>
+                <w:top w:val="nil"/>
+                <w:left w:val="nil"/>
+                <w:bottom w:val="nil"/>
+                <w:right w:val="nil"/>
+                <w:between w:val="nil"/>
+              </w:pBdr>
+              <w:jc w:val="both"/>
+              <w:rPr>
+                <w:color w:val="000000"/>
+                <w:lang w:val="ro-RO"/>
+              </w:rPr>
+            </w:pPr>
+            <w:r>
+              <w:t>984,24</w:t>
+            </w:r>
+          </w:p>
+        </w:tc>
+        <w:tc>
+          <w:tcPr>
+            <w:tcW w:w="0" w:type="auto"/>
+            <w:hideMark/>
+          </w:tcPr>
+          <w:p>
+            <w:pPr>
+              <w:pBdr>
+                <w:top w:val="nil"/>
+                <w:left w:val="nil"/>
+                <w:bottom w:val="nil"/>
+                <w:right w:val="nil"/>
+                <w:between w:val="nil"/>
+              </w:pBdr>
+              <w:jc w:val="both"/>
+              <w:rPr>
+                <w:color w:val="000000"/>
+                <w:lang w:val="ro-RO"/>
+              </w:rPr>
+            </w:pPr>
+            <w:r>
+              <w:t>1081,14</w:t>
+            </w:r>
+          </w:p>
+        </w:tc>
+      </w:tr>
+      <w:tr>
+        <w:trPr>
+          <w:tblCellSpacing w:w="15" w:type="dxa"/>
+        </w:trPr>
+        <w:tc>
+          <w:tcPr>
+            <w:tcW w:w="0" w:type="auto"/>
+            <w:hideMark/>
+          </w:tcPr>
+          <w:p>
+            <w:pPr>
+              <w:pBdr>
+                <w:top w:val="nil"/>
+                <w:left w:val="nil"/>
+                <w:bottom w:val="nil"/>
+                <w:right w:val="nil"/>
+                <w:between w:val="nil"/>
+              </w:pBdr>
+              <w:jc w:val="both"/>
+              <w:rPr>
+                <w:color w:val="000000"/>
+                <w:lang w:val="ro-RO"/>
+              </w:rPr>
+            </w:pPr>
+            <w:r>
+              <w:t>25</w:t>
+            </w:r>
+          </w:p>
+        </w:tc>
+        <w:tc>
+          <w:tcPr>
+            <w:tcW w:w="0" w:type="auto"/>
+            <w:hideMark/>
+          </w:tcPr>
+          <w:p>
+            <w:pPr>
+              <w:pBdr>
+                <w:top w:val="nil"/>
+                <w:left w:val="nil"/>
+                <w:bottom w:val="nil"/>
+                <w:right w:val="nil"/>
+                <w:between w:val="nil"/>
+              </w:pBdr>
+              <w:jc w:val="both"/>
+              <w:rPr>
+                <w:color w:val="000000"/>
+                <w:lang w:val="ro-RO"/>
+              </w:rPr>
+            </w:pPr>
+            <w:r>
+              <w:t>17,31</w:t>
+            </w:r>
+          </w:p>
+        </w:tc>
+        <w:tc>
+          <w:tcPr>
+            <w:tcW w:w="0" w:type="auto"/>
+            <w:hideMark/>
+          </w:tcPr>
+          <w:p>
+            <w:pPr>
+              <w:pBdr>
+                <w:top w:val="nil"/>
+                <w:left w:val="nil"/>
+                <w:bottom w:val="nil"/>
+                <w:right w:val="nil"/>
+                <w:between w:val="nil"/>
+              </w:pBdr>
+              <w:jc w:val="both"/>
+              <w:rPr>
+                <w:color w:val="000000"/>
+                <w:lang w:val="ro-RO"/>
+              </w:rPr>
+            </w:pPr>
+            <w:r>
+              <w:t>900,69</w:t>
+            </w:r>
+          </w:p>
+        </w:tc>
+        <w:tc>
+          <w:tcPr>
+            <w:tcW w:w="0" w:type="auto"/>
+            <w:hideMark/>
+          </w:tcPr>
+          <w:p>
+            <w:pPr>
+              <w:pBdr>
+                <w:top w:val="nil"/>
+                <w:left w:val="nil"/>
+                <w:bottom w:val="nil"/>
+                <w:right w:val="nil"/>
+                <w:between w:val="nil"/>
+              </w:pBdr>
+              <w:jc w:val="both"/>
+              <w:rPr>
+                <w:color w:val="000000"/>
+                <w:lang w:val="ro-RO"/>
+              </w:rPr>
+            </w:pPr>
+            <w:r>
+              <w:t>987,40</w:t>
+            </w:r>
+          </w:p>
+        </w:tc>
+        <w:tc>
+          <w:tcPr>
+            <w:tcW w:w="0" w:type="auto"/>
+            <w:hideMark/>
+          </w:tcPr>
+          <w:p>
+            <w:pPr>
+              <w:pBdr>
+                <w:top w:val="nil"/>
+                <w:left w:val="nil"/>
+                <w:bottom w:val="nil"/>
+                <w:right w:val="nil"/>
+                <w:between w:val="nil"/>
+              </w:pBdr>
+              <w:jc w:val="both"/>
+              <w:rPr>
+                <w:color w:val="000000"/>
+                <w:lang w:val="ro-RO"/>
+              </w:rPr>
+            </w:pPr>
+            <w:r>
+              <w:t>1114,67</w:t>
+            </w:r>
+          </w:p>
+        </w:tc>
+      </w:tr>
+      <w:tr>
+        <w:trPr>
+          <w:tblCellSpacing w:w="15" w:type="dxa"/>
+        </w:trPr>
+        <w:tc>
+          <w:tcPr>
+            <w:tcW w:w="0" w:type="auto"/>
+            <w:hideMark/>
+          </w:tcPr>
+          <w:p>
+            <w:pPr>
+              <w:pBdr>
+                <w:top w:val="nil"/>
+                <w:left w:val="nil"/>
+                <w:bottom w:val="nil"/>
+                <w:right w:val="nil"/>
+                <w:between w:val="nil"/>
+              </w:pBdr>
+              <w:jc w:val="both"/>
+              <w:rPr>
+                <w:color w:val="000000"/>
+                <w:lang w:val="ro-RO"/>
+              </w:rPr>
+            </w:pPr>
+            <w:r>
+              <w:t>50</w:t>
+            </w:r>
+          </w:p>
+        </w:tc>
+        <w:tc>
+          <w:tcPr>
+            <w:tcW w:w="0" w:type="auto"/>
+            <w:hideMark/>
+          </w:tcPr>
+          <w:p>
+            <w:pPr>
+              <w:pBdr>
+                <w:top w:val="nil"/>
+                <w:left w:val="nil"/>
+                <w:bottom w:val="nil"/>
+                <w:right w:val="nil"/>
+                <w:between w:val="nil"/>
+              </w:pBdr>
+              <w:jc w:val="both"/>
+              <w:rPr>
+                <w:color w:val="000000"/>
+                <w:lang w:val="ro-RO"/>
+              </w:rPr>
+            </w:pPr>
+            <w:r>
+              <w:t>17,26</w:t>
+            </w:r>
+          </w:p>
+        </w:tc>
+        <w:tc>
+          <w:tcPr>
+            <w:tcW w:w="0" w:type="auto"/>
+            <w:hideMark/>
+          </w:tcPr>
+          <w:p>
+            <w:pPr>
+              <w:pBdr>
+                <w:top w:val="nil"/>
+                <w:left w:val="nil"/>
+                <w:bottom w:val="nil"/>
+                <w:right w:val="nil"/>
+                <w:between w:val="nil"/>
+              </w:pBdr>
+              <w:jc w:val="both"/>
+              <w:rPr>
+                <w:color w:val="000000"/>
+                <w:lang w:val="ro-RO"/>
+              </w:rPr>
+            </w:pPr>
+            <w:r>
+              <w:t>933,85</w:t>
+            </w:r>
+          </w:p>
+        </w:tc>
+        <w:tc>
+          <w:tcPr>
+            <w:tcW w:w="0" w:type="auto"/>
+            <w:hideMark/>
+          </w:tcPr>
+          <w:p>
+            <w:pPr>
+              <w:pBdr>
+                <w:top w:val="nil"/>
+                <w:left w:val="nil"/>
+                <w:bottom w:val="nil"/>
+                <w:right w:val="nil"/>
+                <w:between w:val="nil"/>
+              </w:pBdr>
+              <w:jc w:val="both"/>
+              <w:rPr>
+                <w:color w:val="000000"/>
+                <w:lang w:val="ro-RO"/>
+              </w:rPr>
+            </w:pPr>
+            <w:r>
+              <w:t>1035,95</w:t>
+            </w:r>
+          </w:p>
+        </w:tc>
+        <w:tc>
+          <w:tcPr>
+            <w:tcW w:w="0" w:type="auto"/>
+            <w:hideMark/>
+          </w:tcPr>
+          <w:p>
+            <w:pPr>
+              <w:pBdr>
+                <w:top w:val="nil"/>
+                <w:left w:val="nil"/>
+                <w:bottom w:val="nil"/>
+                <w:right w:val="nil"/>
+                <w:between w:val="nil"/>
+              </w:pBdr>
+              <w:jc w:val="both"/>
+              <w:rPr>
+                <w:color w:val="000000"/>
+                <w:lang w:val="ro-RO"/>
+              </w:rPr>
+            </w:pPr>
+            <w:r>
+              <w:t>1104,97</w:t>
+            </w:r>
+          </w:p>
+        </w:tc>
+      </w:tr>
+      <w:tr>
+        <w:trPr>
+          <w:tblCellSpacing w:w="15" w:type="dxa"/>
+        </w:trPr>
+        <w:tc>
+          <w:tcPr>
+            <w:tcW w:w="0" w:type="auto"/>
+            <w:hideMark/>
+          </w:tcPr>
+          <w:p>
+            <w:pPr>
+              <w:pBdr>
+                <w:top w:val="nil"/>
+                <w:left w:val="nil"/>
+                <w:bottom w:val="nil"/>
+                <w:right w:val="nil"/>
+                <w:between w:val="nil"/>
+              </w:pBdr>
+              <w:jc w:val="both"/>
+              <w:rPr>
+                <w:color w:val="000000"/>
+                <w:lang w:val="ro-RO"/>
+              </w:rPr>
+            </w:pPr>
+            <w:r>
+              <w:t>100</w:t>
+            </w:r>
+          </w:p>
+        </w:tc>
+        <w:tc>
+          <w:tcPr>
+            <w:tcW w:w="0" w:type="auto"/>
+            <w:hideMark/>
+          </w:tcPr>
+          <w:p>
+            <w:pPr>
+              <w:pBdr>
+                <w:top w:val="nil"/>
+                <w:left w:val="nil"/>
+                <w:bottom w:val="nil"/>
+                <w:right w:val="nil"/>
+                <w:between w:val="nil"/>
+              </w:pBdr>
+              <w:jc w:val="both"/>
+              <w:rPr>
+                <w:color w:val="000000"/>
+                <w:lang w:val="ro-RO"/>
+              </w:rPr>
+            </w:pPr>
+            <w:r>
+              <w:t>17,49</w:t>
+            </w:r>
+          </w:p>
+        </w:tc>
+        <w:tc>
+          <w:tcPr>
+            <w:tcW w:w="0" w:type="auto"/>
+            <w:hideMark/>
+          </w:tcPr>
+          <w:p>
+            <w:pPr>
+              <w:pBdr>
+                <w:top w:val="nil"/>
+                <w:left w:val="nil"/>
+                <w:bottom w:val="nil"/>
+                <w:right w:val="nil"/>
+                <w:between w:val="nil"/>
+              </w:pBdr>
+              <w:jc w:val="both"/>
+              <w:rPr>
+                <w:color w:val="000000"/>
+                <w:lang w:val="ro-RO"/>
+              </w:rPr>
+            </w:pPr>
+            <w:r>
+              <w:t>968,14</w:t>
+            </w:r>
+          </w:p>
+        </w:tc>
+        <w:tc>
+          <w:tcPr>
+            <w:tcW w:w="0" w:type="auto"/>
+            <w:hideMark/>
+          </w:tcPr>
+          <w:p>
+            <w:pPr>
+              <w:pBdr>
+                <w:top w:val="nil"/>
+                <w:left w:val="nil"/>
+                <w:bottom w:val="nil"/>
+                <w:right w:val="nil"/>
+                <w:between w:val="nil"/>
+              </w:pBdr>
+              <w:jc w:val="both"/>
+              <w:rPr>
+                <w:color w:val="000000"/>
+                <w:lang w:val="ro-RO"/>
+              </w:rPr>
+            </w:pPr>
+            <w:r>
+              <w:t>966,80</w:t>
+            </w:r>
+          </w:p>
+        </w:tc>
+        <w:tc>
+          <w:tcPr>
+            <w:tcW w:w="0" w:type="auto"/>
+            <w:hideMark/>
+          </w:tcPr>
+          <w:p>
+            <w:pPr>
+              <w:pBdr>
+                <w:top w:val="nil"/>
+                <w:left w:val="nil"/>
+                <w:bottom w:val="nil"/>
+                <w:right w:val="nil"/>
+                <w:between w:val="nil"/>
+              </w:pBdr>
+              <w:jc w:val="both"/>
+              <w:rPr>
+                <w:color w:val="000000"/>
+                <w:lang w:val="ro-RO"/>
+              </w:rPr>
+            </w:pPr>
+            <w:r>
+              <w:t>1086,96</w:t>
+            </w:r>
+          </w:p>
+        </w:tc>
+      </w:tr>
+    </w:tbl>
+    <w:p>
+      <w:pPr>
+        <w:pBdr>
+          <w:top w:val="nil"/>
+          <w:left w:val="nil"/>
+          <w:bottom w:val="nil"/>
+          <w:right w:val="nil"/>
+          <w:between w:val="nil"/>
+        </w:pBdr>
+        <w:ind w:firstLine="720"/>
+        <w:jc w:val="both"/>
+        <w:rPr>
+          <w:color w:val="000000"/>
+        </w:rPr>
+      </w:pPr>
+    </w:p>
+    <w:p>
+      <w:pPr>
+        <w:pBdr>
+          <w:top w:val="nil"/>
+          <w:left w:val="nil"/>
+          <w:bottom w:val="nil"/>
+          <w:right w:val="nil"/>
+          <w:between w:val="nil"/>
+        </w:pBdr>
+        <w:ind w:firstLine="720"/>
+        <w:jc w:val="both"/>
+        <w:rPr>
+          <w:color w:val="000000"/>
+        </w:rPr>
+      </w:pPr>
+      <w:r>
+        <w:rPr>
+          <w:color w:val="000000"/>
+        </w:rPr>
+        <w:t>Protocolul ZKP manifestă un debit stabil cuprins între 17,26 și 17,49 RPS, valoare care prezintă reziliență la creșterea gradului de concurență, fapt justificat de natura fixă a costului exponențierilor modulare executate pe grupul criptografic de 2048 de biți. În contrast, metodele OAuth 2.0, fundamentate exclusiv pe derivări hash, înregistrează performanțe cantitative superioare, cuprinse între 877 și 1114 RPS. Raportul de performanță stabilit, de aproximativ 1:57 în favoarea metodelor clasice, constituie compromisul computațional necesar pentru asigurarea proprietăților de securitate zero-knowledge și eliminarea vulnerabilităților de transport ale credențialelor.</w:t>
+      </w:r>
+    </w:p>
+    <w:p>
+      <w:pPr>
+        <w:pBdr>
+          <w:top w:val="nil"/>
+          <w:left w:val="nil"/>
+          <w:bottom w:val="nil"/>
+          <w:right w:val="nil"/>
+          <w:between w:val="nil"/>
+        </w:pBdr>
+        <w:ind w:firstLine="720"/>
+        <w:jc w:val="both"/>
+        <w:rPr>
+          <w:color w:val="000000"/>
+        </w:rPr>
+      </w:pPr>
+      <w:r>
+        <w:rPr>
+          <w:color w:val="000000"/>
+        </w:rPr>
+        <w:t xml:space="preserve">Având în vedere diferența substanțială de paradigmă computațională evidențiată de Tabelul 4, o comparație directă între protocolul ZKP și fluxurile OAuth 2.0 nu reflectă cu fidelitate poziționarea soluției propuse în peisajul protocoalelor de autentificare fără divulgarea secretului. Din acest motiv, s-a realizat o evaluare complementară față de două protocoale PAKE (Password-Authenticated Key Exchange) consacrate: SRP-6a (Secure Remote Password, RFC 5054) [ref] și </w:t>
+      </w:r>
+      <w:r>
+        <w:rPr>
+          <w:color w:val="000000"/>
+        </w:rPr>
+        <w:lastRenderedPageBreak/>
+        <w:t>SPAKE2 [ref], ambele fundamentate pe principii de tip zero-knowledge. Pentru a asigura echitatea comparației, implementarea Schnorr a fost adaptată într-un mediu izolat: operațiile de exponențiere au fost migrate de la grupul MODP de 2048 de biți către curba eliptică secp256r1 (NIST P-256), iar protocolul a fost extins cu verificare mutuală (autentificarea bidirecțională a serverului față de client) și derivarea unei chei de sesiune prin ECDH, deoarece atât SRP-6a, cât și SPAKE2 integrează nativ aceste funcționalități. Rezultatele sintetice, obținute pe 100 de iterații, sunt prezentate în Tabelul 5.</w:t>
+      </w:r>
+    </w:p>
+    <w:p>
+      <w:pPr>
+        <w:keepNext/>
+        <w:pBdr>
+          <w:top w:val="nil"/>
+          <w:left w:val="nil"/>
+          <w:bottom w:val="nil"/>
+          <w:right w:val="nil"/>
+          <w:between w:val="nil"/>
+        </w:pBdr>
+        <w:spacing w:before="119"/>
+        <w:jc w:val="center"/>
+        <w:rPr>
+          <w:i/>
+          <w:iCs/>
+          <w:color w:val="004586"/>
+          <w:sz w:val="22"/>
+          <w:szCs w:val="22"/>
+        </w:rPr>
+      </w:pPr>
+      <w:r>
+        <w:rPr>
+          <w:i/>
+          <w:iCs/>
+          <w:color w:val="004586"/>
+          <w:sz w:val="22"/>
+          <w:szCs w:val="22"/>
+        </w:rPr>
+        <w:t xml:space="preserve">Tabelul </w:t>
+      </w:r>
+      <w:r>
+        <w:rPr>
+          <w:i/>
+          <w:iCs/>
+          <w:color w:val="004586"/>
+          <w:sz w:val="22"/>
+          <w:szCs w:val="22"/>
+        </w:rPr>
+        <w:t>5</w:t>
+      </w:r>
+      <w:r>
+        <w:rPr>
+          <w:i/>
+          <w:iCs/>
+          <w:color w:val="004586"/>
+          <w:sz w:val="22"/>
+          <w:szCs w:val="22"/>
+        </w:rPr>
+        <w:t xml:space="preserve">. </w:t>
+      </w:r>
+      <w:r>
+        <w:rPr>
+          <w:i/>
+          <w:iCs/>
+          <w:color w:val="004586"/>
+          <w:sz w:val="22"/>
+          <w:szCs w:val="22"/>
+        </w:rPr>
+        <w:t>Comparația latențelor protocoalelor PAKE (100 iterații)</w:t>
+      </w:r>
+      <w:r>
+        <w:rPr>
+          <w:i/>
+          <w:iCs/>
+          <w:color w:val="004586"/>
+          <w:sz w:val="22"/>
+          <w:szCs w:val="22"/>
+        </w:rPr>
+        <w:t>.</w:t>
+      </w:r>
+    </w:p>
+    <w:tbl>
+      <w:tblPr>
+        <w:tblW w:w="9372" w:type="dxa"/>
+        <w:tblCellSpacing w:w="15" w:type="dxa"/>
+        <w:tblBorders>
+          <w:insideH w:val="single" w:sz="4" w:space="0" w:color="auto"/>
+          <w:insideV w:val="single" w:sz="4" w:space="0" w:color="auto"/>
+        </w:tblBorders>
+        <w:tblCellMar>
+          <w:top w:w="15" w:type="dxa"/>
+          <w:left w:w="15" w:type="dxa"/>
+          <w:bottom w:w="15" w:type="dxa"/>
+          <w:right w:w="15" w:type="dxa"/>
+        </w:tblCellMar>
+        <w:tblLook w:val="04A0" w:firstRow="1" w:lastRow="0" w:firstColumn="1" w:lastColumn="0" w:noHBand="0" w:noVBand="1"/>
+      </w:tblPr>
+      <w:tblGrid>
+        <w:gridCol w:w="2709"/>
+        <w:gridCol w:w="2480"/>
+        <w:gridCol w:w="2643"/>
+        <w:gridCol w:w="1540"/>
+      </w:tblGrid>
+      <w:tr>
+        <w:trPr>
+          <w:trHeight w:val="278"/>
+          <w:tblHeader/>
+          <w:tblCellSpacing w:w="15" w:type="dxa"/>
+        </w:trPr>
+        <w:tc>
+          <w:tcPr>
+            <w:tcW w:w="0" w:type="auto"/>
             <w:vAlign w:val="center"/>
             <w:hideMark/>
           </w:tcPr>
@@ -17632,16 +18248,19 @@
               </w:pBdr>
               <w:jc w:val="both"/>
               <w:rPr>
+                <w:b/>
+                <w:bCs/>
                 <w:color w:val="000000"/>
                 <w:lang w:val="ro-RO"/>
               </w:rPr>
             </w:pPr>
             <w:r>
               <w:rPr>
-                <w:color w:val="000000"/>
-                <w:lang w:val="ro-RO"/>
-              </w:rPr>
-              <w:t>10</w:t>
+                <w:b/>
+                <w:bCs/>
+                <w:color w:val="000000"/>
+              </w:rPr>
+              <w:t>Protocol</w:t>
             </w:r>
           </w:p>
         </w:tc>
@@ -17662,16 +18281,20 @@
               </w:pBdr>
               <w:jc w:val="both"/>
               <w:rPr>
+                <w:b/>
+                <w:bCs/>
                 <w:color w:val="000000"/>
                 <w:lang w:val="ro-RO"/>
               </w:rPr>
             </w:pPr>
             <w:r>
               <w:rPr>
-                <w:color w:val="000000"/>
-                <w:lang w:val="ro-RO"/>
-              </w:rPr>
-              <w:t>178,5</w:t>
+                <w:b/>
+                <w:bCs/>
+                <w:color w:val="000000"/>
+                <w:lang w:val="ro-RO"/>
+              </w:rPr>
+              <w:t>Înregistrare (ms)</w:t>
             </w:r>
           </w:p>
         </w:tc>
@@ -17692,16 +18315,20 @@
               </w:pBdr>
               <w:jc w:val="both"/>
               <w:rPr>
+                <w:b/>
+                <w:bCs/>
                 <w:color w:val="000000"/>
                 <w:lang w:val="ro-RO"/>
               </w:rPr>
             </w:pPr>
             <w:r>
               <w:rPr>
-                <w:color w:val="000000"/>
-                <w:lang w:val="ro-RO"/>
-              </w:rPr>
-              <w:t>1488,6</w:t>
+                <w:b/>
+                <w:bCs/>
+                <w:color w:val="000000"/>
+                <w:lang w:val="ro-RO"/>
+              </w:rPr>
+              <w:t>Autentificare (ms)</w:t>
             </w:r>
           </w:p>
         </w:tc>
@@ -17722,23 +18349,32 @@
               </w:pBdr>
               <w:jc w:val="both"/>
               <w:rPr>
+                <w:b/>
+                <w:bCs/>
                 <w:color w:val="000000"/>
                 <w:lang w:val="ro-RO"/>
               </w:rPr>
             </w:pPr>
             <w:r>
               <w:rPr>
-                <w:color w:val="000000"/>
-                <w:lang w:val="ro-RO"/>
-              </w:rPr>
-              <w:t>1628,0</w:t>
+                <w:b/>
+                <w:bCs/>
+                <w:color w:val="000000"/>
+                <w:lang w:val="ro-RO"/>
+              </w:rPr>
+              <w:t>Total (ms)</w:t>
             </w:r>
           </w:p>
         </w:tc>
+      </w:tr>
+      <w:tr>
+        <w:trPr>
+          <w:trHeight w:val="278"/>
+          <w:tblCellSpacing w:w="15" w:type="dxa"/>
+        </w:trPr>
         <w:tc>
           <w:tcPr>
             <w:tcW w:w="0" w:type="auto"/>
-            <w:vAlign w:val="center"/>
             <w:hideMark/>
           </w:tcPr>
           <w:p>
@@ -17757,23 +18393,13 @@
               </w:rPr>
             </w:pPr>
             <w:r>
-              <w:rPr>
-                <w:color w:val="000000"/>
-                <w:lang w:val="ro-RO"/>
-              </w:rPr>
-              <w:t>815,4</w:t>
+              <w:t>SRP-6a</w:t>
             </w:r>
           </w:p>
         </w:tc>
-      </w:tr>
-      <w:tr>
-        <w:trPr>
-          <w:tblCellSpacing w:w="15" w:type="dxa"/>
-        </w:trPr>
         <w:tc>
           <w:tcPr>
             <w:tcW w:w="0" w:type="auto"/>
-            <w:vAlign w:val="center"/>
             <w:hideMark/>
           </w:tcPr>
           <w:p>
@@ -17792,18 +18418,13 @@
               </w:rPr>
             </w:pPr>
             <w:r>
-              <w:rPr>
-                <w:color w:val="000000"/>
-                <w:lang w:val="ro-RO"/>
-              </w:rPr>
-              <w:t>25</w:t>
+              <w:t>1,204</w:t>
             </w:r>
           </w:p>
         </w:tc>
         <w:tc>
           <w:tcPr>
             <w:tcW w:w="0" w:type="auto"/>
-            <w:vAlign w:val="center"/>
             <w:hideMark/>
           </w:tcPr>
           <w:p>
@@ -17822,18 +18443,13 @@
               </w:rPr>
             </w:pPr>
             <w:r>
-              <w:rPr>
-                <w:color w:val="000000"/>
-                <w:lang w:val="ro-RO"/>
-              </w:rPr>
-              <w:t>230,1</w:t>
+              <w:t>41,061</w:t>
             </w:r>
           </w:p>
         </w:tc>
         <w:tc>
           <w:tcPr>
             <w:tcW w:w="0" w:type="auto"/>
-            <w:vAlign w:val="center"/>
             <w:hideMark/>
           </w:tcPr>
           <w:p>
@@ -17852,18 +18468,19 @@
               </w:rPr>
             </w:pPr>
             <w:r>
-              <w:rPr>
-                <w:color w:val="000000"/>
-                <w:lang w:val="ro-RO"/>
-              </w:rPr>
-              <w:t>1666,4</w:t>
+              <w:t>42,265</w:t>
             </w:r>
           </w:p>
         </w:tc>
+      </w:tr>
+      <w:tr>
+        <w:trPr>
+          <w:trHeight w:val="278"/>
+          <w:tblCellSpacing w:w="15" w:type="dxa"/>
+        </w:trPr>
         <w:tc>
           <w:tcPr>
             <w:tcW w:w="0" w:type="auto"/>
-            <w:vAlign w:val="center"/>
             <w:hideMark/>
           </w:tcPr>
           <w:p>
@@ -17882,18 +18499,13 @@
               </w:rPr>
             </w:pPr>
             <w:r>
-              <w:rPr>
-                <w:color w:val="000000"/>
-                <w:lang w:val="ro-RO"/>
-              </w:rPr>
-              <w:t>1577,3</w:t>
+              <w:t>SPAKE2</w:t>
             </w:r>
           </w:p>
         </w:tc>
         <w:tc>
           <w:tcPr>
             <w:tcW w:w="0" w:type="auto"/>
-            <w:vAlign w:val="center"/>
             <w:hideMark/>
           </w:tcPr>
           <w:p>
@@ -17912,23 +18524,13 @@
               </w:rPr>
             </w:pPr>
             <w:r>
-              <w:rPr>
-                <w:color w:val="000000"/>
-                <w:lang w:val="ro-RO"/>
-              </w:rPr>
-              <w:t>1052,0</w:t>
+              <w:t>N/A</w:t>
             </w:r>
           </w:p>
         </w:tc>
-      </w:tr>
-      <w:tr>
-        <w:trPr>
-          <w:tblCellSpacing w:w="15" w:type="dxa"/>
-        </w:trPr>
         <w:tc>
           <w:tcPr>
             <w:tcW w:w="0" w:type="auto"/>
-            <w:vAlign w:val="center"/>
             <w:hideMark/>
           </w:tcPr>
           <w:p>
@@ -17947,18 +18549,13 @@
               </w:rPr>
             </w:pPr>
             <w:r>
-              <w:rPr>
-                <w:color w:val="000000"/>
-                <w:lang w:val="ro-RO"/>
-              </w:rPr>
-              <w:t>50</w:t>
+              <w:t>13,550</w:t>
             </w:r>
           </w:p>
         </w:tc>
         <w:tc>
           <w:tcPr>
             <w:tcW w:w="0" w:type="auto"/>
-            <w:vAlign w:val="center"/>
             <w:hideMark/>
           </w:tcPr>
           <w:p>
@@ -17977,18 +18574,19 @@
               </w:rPr>
             </w:pPr>
             <w:r>
-              <w:rPr>
-                <w:color w:val="000000"/>
-                <w:lang w:val="ro-RO"/>
-              </w:rPr>
-              <w:t>227,3</w:t>
+              <w:t>13,550</w:t>
             </w:r>
           </w:p>
         </w:tc>
+      </w:tr>
+      <w:tr>
+        <w:trPr>
+          <w:trHeight w:val="278"/>
+          <w:tblCellSpacing w:w="15" w:type="dxa"/>
+        </w:trPr>
         <w:tc>
           <w:tcPr>
             <w:tcW w:w="0" w:type="auto"/>
-            <w:vAlign w:val="center"/>
             <w:hideMark/>
           </w:tcPr>
           <w:p>
@@ -18007,18 +18605,13 @@
               </w:rPr>
             </w:pPr>
             <w:r>
-              <w:rPr>
-                <w:color w:val="000000"/>
-                <w:lang w:val="ro-RO"/>
-              </w:rPr>
-              <w:t>1526,0</w:t>
+              <w:t>Schnorr-EC-Mutual</w:t>
             </w:r>
           </w:p>
         </w:tc>
         <w:tc>
           <w:tcPr>
             <w:tcW w:w="0" w:type="auto"/>
-            <w:vAlign w:val="center"/>
             <w:hideMark/>
           </w:tcPr>
           <w:p>
@@ -18037,18 +18630,13 @@
               </w:rPr>
             </w:pPr>
             <w:r>
-              <w:rPr>
-                <w:color w:val="000000"/>
-                <w:lang w:val="ro-RO"/>
-              </w:rPr>
-              <w:t>1812,3</w:t>
+              <w:t>4,005</w:t>
             </w:r>
           </w:p>
         </w:tc>
         <w:tc>
           <w:tcPr>
             <w:tcW w:w="0" w:type="auto"/>
-            <w:vAlign w:val="center"/>
             <w:hideMark/>
           </w:tcPr>
           <w:p>
@@ -18067,23 +18655,13 @@
               </w:rPr>
             </w:pPr>
             <w:r>
-              <w:rPr>
-                <w:color w:val="000000"/>
-                <w:lang w:val="ro-RO"/>
-              </w:rPr>
-              <w:t>774,5</w:t>
+              <w:t>34,093</w:t>
             </w:r>
           </w:p>
         </w:tc>
-      </w:tr>
-      <w:tr>
-        <w:trPr>
-          <w:tblCellSpacing w:w="15" w:type="dxa"/>
-        </w:trPr>
         <w:tc>
           <w:tcPr>
             <w:tcW w:w="0" w:type="auto"/>
-            <w:vAlign w:val="center"/>
             <w:hideMark/>
           </w:tcPr>
           <w:p>
@@ -18102,131 +18680,7 @@
               </w:rPr>
             </w:pPr>
             <w:r>
-              <w:rPr>
-                <w:color w:val="000000"/>
-                <w:lang w:val="ro-RO"/>
-              </w:rPr>
-              <w:t>100</w:t>
-            </w:r>
-          </w:p>
-        </w:tc>
-        <w:tc>
-          <w:tcPr>
-            <w:tcW w:w="0" w:type="auto"/>
-            <w:vAlign w:val="center"/>
-            <w:hideMark/>
-          </w:tcPr>
-          <w:p>
-            <w:pPr>
-              <w:pBdr>
-                <w:top w:val="nil"/>
-                <w:left w:val="nil"/>
-                <w:bottom w:val="nil"/>
-                <w:right w:val="nil"/>
-                <w:between w:val="nil"/>
-              </w:pBdr>
-              <w:jc w:val="both"/>
-              <w:rPr>
-                <w:color w:val="000000"/>
-                <w:lang w:val="ro-RO"/>
-              </w:rPr>
-            </w:pPr>
-            <w:r>
-              <w:rPr>
-                <w:color w:val="000000"/>
-                <w:lang w:val="ro-RO"/>
-              </w:rPr>
-              <w:t>264,0</w:t>
-            </w:r>
-          </w:p>
-        </w:tc>
-        <w:tc>
-          <w:tcPr>
-            <w:tcW w:w="0" w:type="auto"/>
-            <w:vAlign w:val="center"/>
-            <w:hideMark/>
-          </w:tcPr>
-          <w:p>
-            <w:pPr>
-              <w:pBdr>
-                <w:top w:val="nil"/>
-                <w:left w:val="nil"/>
-                <w:bottom w:val="nil"/>
-                <w:right w:val="nil"/>
-                <w:between w:val="nil"/>
-              </w:pBdr>
-              <w:jc w:val="both"/>
-              <w:rPr>
-                <w:color w:val="000000"/>
-                <w:lang w:val="ro-RO"/>
-              </w:rPr>
-            </w:pPr>
-            <w:r>
-              <w:rPr>
-                <w:color w:val="000000"/>
-                <w:lang w:val="ro-RO"/>
-              </w:rPr>
-              <w:t>1488,9</w:t>
-            </w:r>
-          </w:p>
-        </w:tc>
-        <w:tc>
-          <w:tcPr>
-            <w:tcW w:w="0" w:type="auto"/>
-            <w:vAlign w:val="center"/>
-            <w:hideMark/>
-          </w:tcPr>
-          <w:p>
-            <w:pPr>
-              <w:pBdr>
-                <w:top w:val="nil"/>
-                <w:left w:val="nil"/>
-                <w:bottom w:val="nil"/>
-                <w:right w:val="nil"/>
-                <w:between w:val="nil"/>
-              </w:pBdr>
-              <w:jc w:val="both"/>
-              <w:rPr>
-                <w:color w:val="000000"/>
-                <w:lang w:val="ro-RO"/>
-              </w:rPr>
-            </w:pPr>
-            <w:r>
-              <w:rPr>
-                <w:color w:val="000000"/>
-                <w:lang w:val="ro-RO"/>
-              </w:rPr>
-              <w:t>1641,1</w:t>
-            </w:r>
-          </w:p>
-        </w:tc>
-        <w:tc>
-          <w:tcPr>
-            <w:tcW w:w="0" w:type="auto"/>
-            <w:vAlign w:val="center"/>
-            <w:hideMark/>
-          </w:tcPr>
-          <w:p>
-            <w:pPr>
-              <w:pBdr>
-                <w:top w:val="nil"/>
-                <w:left w:val="nil"/>
-                <w:bottom w:val="nil"/>
-                <w:right w:val="nil"/>
-                <w:between w:val="nil"/>
-              </w:pBdr>
-              <w:jc w:val="both"/>
-              <w:rPr>
-                <w:color w:val="000000"/>
-                <w:lang w:val="ro-RO"/>
-              </w:rPr>
-            </w:pPr>
-            <w:r>
-              <w:rPr>
-                <w:color w:val="000000"/>
-                <w:lang w:val="ro-RO"/>
-              </w:rPr>
-              <w:t>1116,7</w:t>
+              <w:t>38,090</w:t>
             </w:r>
           </w:p>
         </w:tc>
@@ -18247,6 +18701,12 @@
           <w:color w:val="000000"/>
         </w:rPr>
       </w:pPr>
+      <w:r>
+        <w:rPr>
+          <w:color w:val="000000"/>
+        </w:rPr>
+        <w:t>Protocolul SPAKE2, operat pe curba Ed25519, înregistrează cea mai redusă latență totală (13,55 ms), beneficiind de absența unei etape distincte de înregistrare. SRP-6a prezintă cel mai ridicat cost total (42,27 ms), dominat de exponențierile modulare pe grupul MODP de 2048 de biți, în timp ce varianta Schnorr-EC-Mutual, migrată pe secp256r1, se poziționează intermediar (38,09 ms), costul fiind distribuit între demonstrațiile bidirecționale (24,99 ms) și derivarea cheii de sesiune prin ECDH (9,09 ms). Toate cele trei protocoale asigură autentificare mutuală, derivarea unei chei de sesiune și netransmiterea parolei prin rețea. SRP-6a și SPAKE2 oferă suplimentar rezistență la compromiterea bazei de date, proprietate pe care varianta Schnorr curentă nu o implementează nativ, aceasta constituind o direcție prioritară de dezvoltare. Din punct de vedere al nivelului de securitate, SRP-6a operează la aproximativ 112 biți, în timp ce SPAKE2 și Schnorr-EC-Mutual ating 128 de biți, iar în ceea ce privește standardizarea, doar SRP-6a beneficiază de o specificație formalizată (RFC 5054).</w:t>
+      </w:r>
     </w:p>
     <w:p>
       <w:pPr>
@@ -18263,12 +18723,6 @@
           <w:color w:val="000000"/>
         </w:rPr>
       </w:pPr>
-      <w:r>
-        <w:rPr>
-          <w:color w:val="000000"/>
-        </w:rPr>
-        <w:t>Protocolul ZKP manifestă un debit stabil cuprins între 178 și 264 RPS, valoare care prezintă reziliență la creșterea gradului de concurență, fapt justificat de natura fixă a costului exponențierilor modulare executate pe grupul criptografic de 2048 biți. În contrast, metodele OAuth 2.0, fundamentate exclusiv pe derivări hash, înregistrează performanțe cantitative superioare, cuprinse între 774 și 1812 RPS. Raportul de performanță stabilit, de aproximativ 1:7 în favoarea metodelor clasice, constituie compromisul computațional necesar pentru asigurarea proprietăților de securitate zero-knowledge și eliminarea vulnerabilităților de transport ale credențialelor.</w:t>
-      </w:r>
     </w:p>
     <w:p>
       <w:pPr>
@@ -18285,41 +18739,6 @@
           <w:color w:val="000000"/>
         </w:rPr>
       </w:pPr>
-      <w:r>
-        <w:rPr>
-          <w:color w:val="000000"/>
-        </w:rPr>
-        <w:t xml:space="preserve">În vederea confirmării proprietății zero-knowledge la nivelul traficului de rețea, s-a efectuat un audit al conținutului pachetelor HTTP transmise în fiecare paradigmă de autentificare. Această procedură de testare deține o valoare probatorie fundamentală pentru prezenta cercetare, întrucât demonstrează în mod direct ce informații sunt expuse unui potențial adversar capabil să intercepteze canalul de comunicație. Analiza punctelor terminale ale protocolului ZKP (POST /login/commit și POST /login/verify) a relevat că acestea vehiculează exclusiv valori numerice efemere, respectiv angajamentul t și dovada matematică s, ambele reprezentate ca numere întregi </w:t>
-      </w:r>
-      <w:r>
-        <w:rPr>
-          <w:color w:val="000000"/>
-        </w:rPr>
-        <w:lastRenderedPageBreak/>
-        <w:t>de mari dimensiuni, lipsite de orice corelație directă cu secretul utilizatorului. În contrast, fluxul de autentificare clasic (POST /classic/login) expune parola în format brut (plaintext) în corpul cererii, aceasta fiind complet vizibilă oricărui adversar capabil să intercepteze canalul de transport. În schemele OAuth 2.0 PKCE și Simple, deși credențialele nu sunt propagate către serverul de resurse, ele sunt transmise obligatoriu către serverul de autorizare în etapa de aprobare (POST /oauth/pkce/authorize, respectiv POST /oauth/simple/authorize), vulnerabilitatea la nivelul acestui segment al rețelei menținându-se nealterată. Implementarea bazată pe Authlib prezintă un comportament similar, parola fiind inclusă alături de parametrii PKCE în corpul cererii de autorizare (POST /authlib/oauth/authorize). Astfel, schema criptografică Schnorr integrată reprezintă singura variantă operațională în care materialul secret nu traversează rețeaua, capturarea integrală a unui schimb de mesaje ZKP neoferind unui atacator nicio informație exploatabilă pentru o autentificare frauduloasă ulterioară sau pentru extragerea credențialelor.</w:t>
-      </w:r>
-    </w:p>
-    <w:p>
-      <w:pPr>
-        <w:pBdr>
-          <w:top w:val="nil"/>
-          <w:left w:val="nil"/>
-          <w:bottom w:val="nil"/>
-          <w:right w:val="nil"/>
-          <w:between w:val="nil"/>
-        </w:pBdr>
-        <w:ind w:firstLine="720"/>
-        <w:jc w:val="both"/>
-        <w:rPr>
-          <w:color w:val="000000"/>
-        </w:rPr>
-      </w:pPr>
-      <w:r>
-        <w:rPr>
-          <w:color w:val="000000"/>
-        </w:rPr>
-        <w:t>Validarea finală a stabilității arhitecturale a constat într-un test dinamic de sarcină, orchestrat cu ajutorul utilitarului Locust. S-a simulat un trafic concurent generat de 50 de utilizatori simultani, desfășurat pe un interval de 30 de secunde. Analiza rezultatelor agregate a confirmat execuția cu succes a 23 137 de cereri, fără înregistrarea niciunei erori de procesare, cu o rată medie agregată de aproximativ 390 de cereri pe secundă. Latența mediană per cerere s-a situat la 120 ms, cu o percentilă P95 de 3000 ms și un timp maxim de 6830 ms, variații explicabile prin concurența ridicată și mecanismele de planificare ale utilitarului. Privind fluxurile complete de autentificare reconstituite de Locust, protocolul ZKP a înregistrat o latență mediană de 340 ms (P95: 3600 ms), fluxurile OAuth2 PKCE și Simple s-au poziționat la o latență mediană de 210, respectiv 220 ms (P95: 3400 ms), iar varianta Authlib PKCE a prezentat o latență mediană de 97 ms (P95: 2600 ms). Convergența relativă a timpilor de răspuns în raport cu diferențele marcante observate în regim izolat (benchmark offline) demonstrează că, într-un mediu cu încărcare realistă, diferențele strict criptografice sunt atenuate de costurile asociate infrastructurii, de alocarea resurselor de rețea și de suprasarcina utilitarului de testare, confirmând viabilitatea operațională a protocolului ZKP în condiții de producție.</w:t>
-      </w:r>
     </w:p>
     <w:p>
       <w:pPr>
@@ -18534,6 +18953,22 @@
         </w:rPr>
         <w:t xml:space="preserve"> (mod P), serverul returnând codul de eroare HTTP 401. Această respingere este fundamentată pe inegalitatea y ≠ x în spațiul exponenților: cheia publică y reprezintă rezultatul exponențierii modulare, nu exponentul în sine, iar substituirea acesteia în formula dovezii produce un dezechilibru matematic imposibil de compensat fără cunoașterea valorii private x. Se confirmă astfel că sustragerea materialului criptografic stocat pe server nu furnizează unui atacator capacitatea de generare a unor dovezi valide cu cunoștințe zero, proprietate care diferențiază fundamental schema Schnorr de paradigmele bazate pe stocarea rezumatelor criptografice ale parolelor.</w:t>
       </w:r>
+      <w:r>
+        <w:t xml:space="preserve"> </w:t>
+      </w:r>
+      <w:r>
+        <w:rPr>
+          <w:color w:val="000000"/>
+        </w:rPr>
+        <w:t xml:space="preserve">Cu toate acestea, analiza comparativă prezentată în secțiunea III.3 (Tabelul 5) a evidențiat faptul că protocoalele SRP-6a și </w:t>
+      </w:r>
+      <w:r>
+        <w:rPr>
+          <w:color w:val="000000"/>
+        </w:rPr>
+        <w:lastRenderedPageBreak/>
+        <w:t>SPAKE2 oferă suplimentar rezistență la compromiterea bazei de date (server-breach resistance), proprietate pe care implementarea curentă a schemei Schnorr nu o integrează nativ, reprezentând o direcție prioritară de dezvoltare.</w:t>
+      </w:r>
     </w:p>
     <w:p>
       <w:pPr>
@@ -18554,51 +18989,7 @@
         <w:rPr>
           <w:color w:val="000000"/>
         </w:rPr>
-        <w:t xml:space="preserve">În completarea analizei de reziliență, s-a evaluat calitatea sursei de entropie criptografică utilizată pentru generarea provocărilor și a identificatorilor de sesiune. Printr-o secvență de 10 000 </w:t>
-      </w:r>
-      <w:r>
-        <w:rPr>
-          <w:color w:val="000000"/>
-        </w:rPr>
-        <w:lastRenderedPageBreak/>
-        <w:t>de cereri de angajament consecutive, s-a verificat distribuția statistică și absența coliziunilor atât pentru valorile provocărilor (challenge_c), cât și pentru identificatorii de sesiune (session_id). Toate cele 10 000 de valori au fost confirmate ca fiind strict unice, fără nicio coliziune detectată, iar provocările au fost corect încadrate în intervalul matematic specificat [1, P-2], validându-se astfel eficacitatea generatorului de numere pseudo-aleatoare securizat criptografic (CSPRNG) implementat în arhitectură. Unicitatea provocărilor este esențială pentru prevenirea atacurilor de tip replay, întrucât reutilizarea unei valori c ar permite unui adversar care a interceptat un schimb anterior (t, c, s) să reproducă autentificarea fără a deține secretul, în timp ce unicitatea identificatorilor de sesiune, generați pe 256 de biți de entropie, face ca probabilitatea de ghicire prin forță brută să fie de ordinul 1/</w:t>
-      </w:r>
-      <m:oMath>
-        <m:sSup>
-          <m:sSupPr>
-            <m:ctrlPr>
-              <w:rPr>
-                <w:rFonts w:ascii="Cambria Math" w:eastAsia="Cambria Math" w:hAnsi="Cambria Math" w:cs="Cambria Math"/>
-                <w:i/>
-                <w:color w:val="000000"/>
-              </w:rPr>
-            </m:ctrlPr>
-          </m:sSupPr>
-          <m:e>
-            <m:r>
-              <w:rPr>
-                <w:rFonts w:ascii="Cambria Math" w:eastAsia="Cambria Math" w:hAnsi="Cambria Math" w:cs="Cambria Math"/>
-                <w:color w:val="000000"/>
-              </w:rPr>
-              <m:t>2</m:t>
-            </m:r>
-          </m:e>
-          <m:sup>
-            <m:r>
-              <w:rPr>
-                <w:rFonts w:ascii="Cambria Math" w:eastAsia="Cambria Math" w:hAnsi="Cambria Math" w:cs="Cambria Math"/>
-                <w:color w:val="000000"/>
-              </w:rPr>
-              <m:t>256</m:t>
-            </m:r>
-          </m:sup>
-        </m:sSup>
-      </m:oMath>
-      <w:r>
-        <w:rPr>
-          <w:color w:val="000000"/>
-        </w:rPr>
-        <w:t xml:space="preserve"> per tentativă, fapt confirmat experimental prin 500 de încercări succesive de acces cu identificatori aleatorii, toate respinse cu codul HTTP 404.</w:t>
+        <w:t>În completarea analizei de reziliență, s-a evaluat calitatea sursei de entropie criptografică utilizată pentru generarea provocărilor și a identificatorilor de sesiune. Printr-o secvență de 10 000 de cereri de angajament consecutive, s-a verificat distribuția statistică și absența coliziunilor atât pentru valorile provocărilor (challenge_c), cât și pentru identificatorii de sesiune (session_id). Toate cele 10 000 de valori au fost confirmate ca fiind strict unice, fără nicio coliziune detectată, iar provocările au fost corect încadrate în intervalul matematic specificat [1, P-2], validându-se astfel eficacitatea generatorului de numere pseudo-aleatoare securizat criptografic (CSPRNG) implementat în arhitectură. Unicitatea provocărilor este esențială pentru prevenirea atacurilor de tip replay, întrucât reutilizarea unei valori c ar permite unui adversar care a interceptat un schimb anterior (t, c, s) să reproducă autentificarea fără a deține secretul, în timp ce unicitatea identificatorilor de sesiune, generați pe 256 de biți de entropie, face ca probabilitatea de ghicire prin forță brută să fie de ordinul 1/2^256 per tentativă, fapt confirmat experimental prin 500 de încercări succesive de acces cu identificatori aleatorii, toate respinse cu codul HTTP 404.</w:t>
       </w:r>
     </w:p>
     <w:p>
@@ -18620,93 +19011,7 @@
         <w:rPr>
           <w:color w:val="000000"/>
         </w:rPr>
-        <w:t>Pe de altă parte, o suprafață de atac vulnerabilă în cadrul protocoalelor bazate pe problema logaritmului discret este reprezentată de faza de distribuție a parametrilor publici. În acest sens, s-a simulat un atac de tip Man-in-the-Middle (MitM) bazat pe injectarea unor parametri slabi (P = 23, Q = 11, G = 4), prin interceptarea și substituirea răspunsului punctului terminal GET /parameters. S-a demonstrat că, prin acceptarea acestor parametri minimali de către un client neprotejat, complexitatea problemei logaritmului discret colapsează, grupul criptografic având doar 11 elemente în loc de aproximativ</w:t>
-      </w:r>
-      <w:r>
-        <w:rPr>
-          <w:color w:val="000000"/>
-        </w:rPr>
-        <w:t xml:space="preserve"> </w:t>
-      </w:r>
-      <m:oMath>
-        <m:sSup>
-          <m:sSupPr>
-            <m:ctrlPr>
-              <w:rPr>
-                <w:rFonts w:ascii="Cambria Math" w:eastAsia="Cambria Math" w:hAnsi="Cambria Math" w:cs="Cambria Math"/>
-                <w:i/>
-                <w:color w:val="000000"/>
-              </w:rPr>
-            </m:ctrlPr>
-          </m:sSupPr>
-          <m:e>
-            <m:r>
-              <w:rPr>
-                <w:rFonts w:ascii="Cambria Math" w:eastAsia="Cambria Math" w:hAnsi="Cambria Math" w:cs="Cambria Math"/>
-                <w:color w:val="000000"/>
-              </w:rPr>
-              <m:t>2</m:t>
-            </m:r>
-          </m:e>
-          <m:sup>
-            <m:r>
-              <w:rPr>
-                <w:rFonts w:ascii="Cambria Math" w:eastAsia="Cambria Math" w:hAnsi="Cambria Math" w:cs="Cambria Math"/>
-                <w:color w:val="000000"/>
-              </w:rPr>
-              <m:t>1023</m:t>
-            </m:r>
-          </m:sup>
-        </m:sSup>
-      </m:oMath>
-      <w:r>
-        <w:rPr>
-          <w:color w:val="000000"/>
-        </w:rPr>
-        <w:t>, ceea ce permite rezolvarea prin forță brută în cel mult P - 2 pași. În consecință, un adversar poate recupera cheia privată a victimei și poate finaliza cu succes fluxul protocolului în calitate de impostor. Cu toate acestea, testul complementar a demonstrat că serverul, atunci când operează cu parametrii originari de înaltă securitate, respinge în mod proactiv la faza de înregistrare orice cheie publică y care nu satisface condiția de apartenență la subgrupul legitim (</w:t>
-      </w:r>
-      <w:r>
-        <w:rPr>
-          <w:color w:val="000000"/>
-        </w:rPr>
-        <w:t xml:space="preserve"> </w:t>
-      </w:r>
-      <m:oMath>
-        <m:sSup>
-          <m:sSupPr>
-            <m:ctrlPr>
-              <w:rPr>
-                <w:rFonts w:ascii="Cambria Math" w:eastAsia="Cambria Math" w:hAnsi="Cambria Math" w:cs="Cambria Math"/>
-                <w:i/>
-                <w:color w:val="000000"/>
-              </w:rPr>
-            </m:ctrlPr>
-          </m:sSupPr>
-          <m:e>
-            <m:r>
-              <w:rPr>
-                <w:rFonts w:ascii="Cambria Math" w:eastAsia="Cambria Math" w:hAnsi="Cambria Math" w:cs="Cambria Math"/>
-                <w:color w:val="000000"/>
-              </w:rPr>
-              <m:t>y</m:t>
-            </m:r>
-          </m:e>
-          <m:sup>
-            <m:r>
-              <w:rPr>
-                <w:rFonts w:ascii="Cambria Math" w:eastAsia="Cambria Math" w:hAnsi="Cambria Math" w:cs="Cambria Math"/>
-                <w:color w:val="000000"/>
-              </w:rPr>
-              <m:t>Q</m:t>
-            </m:r>
-          </m:sup>
-        </m:sSup>
-      </m:oMath>
-      <w:r>
-        <w:rPr>
-          <w:color w:val="000000"/>
-        </w:rPr>
-        <w:t xml:space="preserve"> mod P = 1), returnând codul HTTP 422 și blocând atacul înainte de a permite crearea unui cont exploatabil. Această vulnerabilitate impune constrângerea arhitecturală ca aplicația client să ancoreze (pinning) valorile parametrilor de referință și să respingă orice deviație detectată în rețea, iar pe partea de server, validarea strictă a apartenenței la subgrup constituie o barieră eficientă împotriva injectării de parametri frauduloși.</w:t>
+        <w:t>Pe de altă parte, o suprafață de atac vulnerabilă în cadrul protocoalelor bazate pe problema logaritmului discret este reprezentată de faza de distribuție a parametrilor publici. În acest sens, s-a simulat un atac de tip Man-in-the-Middle (MitM) bazat pe injectarea unor parametri slabi (P = 23, Q = 11, G = 4), prin interceptarea și substituirea răspunsului punctului terminal GET /parameters. S-a demonstrat că, prin acceptarea acestor parametri minimali de către un client neprotejat, complexitatea problemei logaritmului discret colapsează, grupul criptografic având doar 11 elemente în loc de aproximativ 2^1023, ceea ce permite rezolvarea prin forță brută în cel mult P - 2 pași. În consecință, un adversar poate recupera cheia privată a victimei și poate finaliza cu succes fluxul protocolului în calitate de impostor. Cu toate acestea, testul complementar a demonstrat că serverul, atunci când operează cu parametrii originari de înaltă securitate, respinge în mod proactiv la faza de înregistrare orice cheie publică y care nu satisface condiția de apartenență la subgrupul legitim (y^Q mod P = 1), returnând codul HTTP 422 și blocând atacul înainte de a permite crearea unui cont exploatabil. Această vulnerabilitate impune constrângerea arhitecturală ca aplicația client să ancoreze (pinning) valorile parametrilor de referință și să respingă orice deviație detectată în rețea, iar pe partea de server, validarea strictă a apartenenței la subgrup constituie o barieră eficientă împotriva injectării de parametri frauduloși.</w:t>
       </w:r>
     </w:p>
     <w:p>
@@ -18728,110 +19033,8 @@
         <w:rPr>
           <w:color w:val="000000"/>
         </w:rPr>
-        <w:t xml:space="preserve">Pentru a demonstra fezabilitatea securității arhitecturii pe termen lung, a fost realizat un experiment de escaladare progresivă a atacului prin forță brută asupra problemei logaritmului discret. Pornind de la instanțe triviale de 8 biți (P = 167, spațiu de căutare de 83 de candidați) și urcând treptat prin pragurile de 12, 16, 20, 24, 28 și 32 de biți, toate firele de execuție au fost lansate în paralel cu un termen limită de 600 de secunde. Rezultatele au confirmat o creștere exponențială a efortului de calcul: instanțele de 8 biți au fost rezolvate în 26 de iterații (1,8 secunde), cele de 24 de biți în 2 891 456 de iterații (3,2 secunde), iar cele de 32 de biți în 744 702 253 de iterații (282,7 secunde). La pragul de 64 de biți, atacul a fost întrerupt după epuizarea termenului de 600 de secunde, parcurgând doar 1 444 529 212 de iterații din cele aproximativ 4,6 · </w:t>
-      </w:r>
-      <m:oMath>
-        <m:sSup>
-          <m:sSupPr>
-            <m:ctrlPr>
-              <w:rPr>
-                <w:rFonts w:ascii="Cambria Math" w:eastAsia="Cambria Math" w:hAnsi="Cambria Math" w:cs="Cambria Math"/>
-                <w:i/>
-                <w:color w:val="000000"/>
-              </w:rPr>
-            </m:ctrlPr>
-          </m:sSupPr>
-          <m:e>
-            <m:r>
-              <w:rPr>
-                <w:rFonts w:ascii="Cambria Math" w:eastAsia="Cambria Math" w:hAnsi="Cambria Math" w:cs="Cambria Math"/>
-                <w:color w:val="000000"/>
-              </w:rPr>
-              <m:t>10</m:t>
-            </m:r>
-          </m:e>
-          <m:sup>
-            <m:r>
-              <w:rPr>
-                <w:rFonts w:ascii="Cambria Math" w:eastAsia="Cambria Math" w:hAnsi="Cambria Math" w:cs="Cambria Math"/>
-                <w:color w:val="000000"/>
-              </w:rPr>
-              <m:t>18</m:t>
-            </m:r>
-          </m:sup>
-        </m:sSup>
-      </m:oMath>
-      <w:r>
-        <w:rPr>
-          <w:color w:val="000000"/>
-        </w:rPr>
-        <w:t xml:space="preserve"> </w:t>
-      </w:r>
-      <w:r>
-        <w:rPr>
-          <w:color w:val="000000"/>
-        </w:rPr>
-        <w:t>necesare. Instanțele de 128 de biți și, respectiv, de 1024 de biți, corespunzătoare parametrilor efectivi ai protocolului, au înregistrat un comportament similar, demonstrând că spațiul de căutare de ordinul</w:t>
-      </w:r>
-      <w:r>
-        <w:rPr>
-          <w:color w:val="000000"/>
-        </w:rPr>
-        <w:t xml:space="preserve"> </w:t>
-      </w:r>
-      <m:oMath>
-        <m:sSup>
-          <m:sSupPr>
-            <m:ctrlPr>
-              <w:rPr>
-                <w:rFonts w:ascii="Cambria Math" w:eastAsia="Cambria Math" w:hAnsi="Cambria Math" w:cs="Cambria Math"/>
-                <w:i/>
-                <w:color w:val="000000"/>
-              </w:rPr>
-            </m:ctrlPr>
-          </m:sSupPr>
-          <m:e>
-            <m:r>
-              <w:rPr>
-                <w:rFonts w:ascii="Cambria Math" w:eastAsia="Cambria Math" w:hAnsi="Cambria Math" w:cs="Cambria Math"/>
-                <w:color w:val="000000"/>
-              </w:rPr>
-              <m:t>2</m:t>
-            </m:r>
-          </m:e>
-          <m:sup>
-            <m:r>
-              <w:rPr>
-                <w:rFonts w:ascii="Cambria Math" w:eastAsia="Cambria Math" w:hAnsi="Cambria Math" w:cs="Cambria Math"/>
-                <w:color w:val="000000"/>
-              </w:rPr>
-              <m:t>512</m:t>
-            </m:r>
-          </m:sup>
-        </m:sSup>
-      </m:oMath>
-      <w:r>
-        <w:rPr>
-          <w:color w:val="000000"/>
-        </w:rPr>
-        <w:t xml:space="preserve"> candidați depășește cu mult capacitatea computațională a oricărei arhitecturi clasice existente sau previzibile. Prin fundamentarea sistemului pe un număr prim sigur (safe prime) de 2048 de biți și un subgrup operațional de aproximativ 1023 de biți, obținerea cheii private prin metode exhaustive devine computațional nefezabilă în ipotezele standard de complexitate algoritmică actuale.</w:t>
-      </w:r>
-    </w:p>
-    <w:p>
-      <w:pPr>
-        <w:pBdr>
-          <w:top w:val="nil"/>
-          <w:left w:val="nil"/>
-          <w:bottom w:val="nil"/>
-          <w:right w:val="nil"/>
-          <w:between w:val="nil"/>
-        </w:pBdr>
-        <w:ind w:firstLine="720"/>
-        <w:jc w:val="both"/>
-        <w:rPr>
-          <w:color w:val="000000"/>
-        </w:rPr>
-      </w:pPr>
+        <w:t>Pentru a demonstra fezabilitatea securității arhitecturii pe termen lung, a fost realizat un experiment de escaladare progresivă a atacului prin forță brută asupra problemei logaritmului discret. Pornind de la instanțe triviale de 8 biți (P = 167, spațiu de căutare de 83 de candidați) și urcând treptat prin pragurile de 12, 16, 20, 24, 28 și 32 de biți, toate firele de execuție au fost lansate în paralel cu un termen limită de 600 de secunde. Rezultatele au confirmat o creștere exponențială a efortului de calcul: instanțele de 8 biți au fost rezolvate în 26 de iterații (1,8 secunde), cele de 24 de biți în 2 891 456 de iterații (3,2 secunde), iar cele de 32 de biți în 744 702 253 de iterații (282,7 secunde). La pragul de 64 de biți, atacul a fost întrerupt după epuizarea termenului de 600 de secunde, parcurgând doar 1 444 529 212 de iterații din cele aproximativ 4,6 · 10^18 necesare. Instanțele de 128 și 1024 de biți au înregistrat un comportament similar, fără progres semnificativ în intervalul alocat, demonstrând că spațiul de căutare de ordinul 2^2048 candidați, corespunzător parametrilor efectivi ai protocolului, depășește cu mult capacitatea computațională a oricărei arhitecturi clasice existente sau previzibile. Prin fundamentarea sistemului pe un număr prim sigur (safe prime) de 2048 de biți și un subgrup operațional de aproximativ 1023 de biți, obținerea cheii private prin metode exhaustive devine computațional nefezabilă în ipotezele standard de complexitate algoritmică actuale.</w:t>
+      </w:r>
     </w:p>
     <w:p>
       <w:pPr>
@@ -19033,15 +19236,22 @@
           <w:color w:val="000000"/>
           <w:lang w:val="ro-RO"/>
         </w:rPr>
-        <w:t xml:space="preserve">. Infrastructura necesită externalizarea stocării sesiunilor către soluții de tip in-memory data store și migrarea stratului de date relațional către platforme robuste. Din perspectiva gestionării jetoanelor, se preconizează trecerea de la semnături simetrice (HS256) către algoritmi asimetrici (RS256 sau ES256), decuplând procesele de emitere de cele de verificare. Consolidarea perimetrului de securitate presupune integrarea mecanismelor de limitare a ratei de </w:t>
+        <w:t>, avand in vedere avansul tehnologic si posibilitatea ca o cheie de 2048 de biti sa nu mai ofere securitate</w:t>
       </w:r>
       <w:r>
         <w:rPr>
           <w:color w:val="000000"/>
           <w:lang w:val="ro-RO"/>
         </w:rPr>
+        <w:t xml:space="preserve">. Infrastructura necesită externalizarea stocării sesiunilor către soluții de tip in-memory data store și migrarea stratului de date relațional către platforme robuste. Din perspectiva gestionării jetoanelor, se preconizează trecerea de la semnături simetrice (HS256) către algoritmi asimetrici (RS256 sau ES256), decuplând procesele de emitere de cele de verificare. </w:t>
+      </w:r>
+      <w:r>
+        <w:rPr>
+          <w:color w:val="000000"/>
+          <w:lang w:val="ro-RO"/>
+        </w:rPr>
         <w:lastRenderedPageBreak/>
-        <w:t>acces, jurnalizarea structurată a evenimentelor de securitate, liste de revocare a jetoanelor și restricționarea comunicării exclusiv prin protocolul HTTPS. Pe termen lung, încorporarea jetoanelor de tip proof-of-possession va elimina riscurile modelului bazat pe bearer token.</w:t>
+        <w:t>Consolidarea perimetrului de securitate presupune integrarea mecanismelor de limitare a ratei de acces, jurnalizarea structurată a evenimentelor de securitate, liste de revocare a jetoanelor și restricționarea comunicării exclusiv prin protocolul HTTPS. Pe termen lung, încorporarea jetoanelor de tip proof-of-possession va elimina riscurile modelului bazat pe bearer token.</w:t>
       </w:r>
     </w:p>
     <w:p>
@@ -20907,12 +21117,26 @@
           <w:sz w:val="22"/>
           <w:szCs w:val="22"/>
         </w:rPr>
-        <w:t>Konstantina Souvatzidaki, K.; Limniotis, K. Post-Quantum Key Exchange in TLS 1.3: Further Analysis on Performance of New Cryptographic Standards. Cryptography 2025, 9, 73. https://doi.org/10.3390/cryptography9040073</w:t>
-      </w:r>
+        <w:t xml:space="preserve">Konstantina Souvatzidaki, K.; Limniotis, K. Post-Quantum Key Exchange in TLS 1.3: Further Analysis on Performance of New Cryptographic Standards. Cryptography 2025, 9, 73. </w:t>
+      </w:r>
+      <w:hyperlink r:id="rId19" w:history="1">
+        <w:r>
+          <w:rPr>
+            <w:rStyle w:val="Hyperlink"/>
+            <w:sz w:val="22"/>
+            <w:szCs w:val="22"/>
+          </w:rPr>
+          <w:t>https://doi.org/10.3390/cryptography9040073</w:t>
+        </w:r>
+      </w:hyperlink>
     </w:p>
     <w:p>
       <w:pPr>
         <w:widowControl/>
+        <w:numPr>
+          <w:ilvl w:val="0"/>
+          <w:numId w:val="1"/>
+        </w:numPr>
         <w:pBdr>
           <w:top w:val="nil"/>
           <w:left w:val="nil"/>
@@ -20931,37 +21155,7 @@
           <w:szCs w:val="22"/>
         </w:rPr>
       </w:pPr>
-    </w:p>
-    <w:p>
-      <w:pPr>
-        <w:widowControl/>
-        <w:pBdr>
-          <w:top w:val="nil"/>
-          <w:left w:val="nil"/>
-          <w:bottom w:val="nil"/>
-          <w:right w:val="nil"/>
-          <w:between w:val="nil"/>
-        </w:pBdr>
-        <w:tabs>
-          <w:tab w:val="left" w:pos="450"/>
-        </w:tabs>
-        <w:spacing w:after="50"/>
-        <w:jc w:val="both"/>
-        <w:rPr>
-          <w:color w:val="000000"/>
-          <w:sz w:val="22"/>
-          <w:szCs w:val="22"/>
-        </w:rPr>
-      </w:pPr>
-      <w:r>
-        <w:rPr>
-          <w:color w:val="000000"/>
-          <w:sz w:val="22"/>
-          <w:szCs w:val="22"/>
-        </w:rPr>
-        <w:t xml:space="preserve">Ultimul logjam a fost in 2019 pentru 795 bit </w:t>
-      </w:r>
-      <w:hyperlink r:id="rId19" w:anchor=":~:text=On%202%20Dec%202019%2C%20Fabrice,prime%20above%20RSA%2D240)." w:history="1">
+      <w:hyperlink r:id="rId20" w:anchor=":~:text=On%202%20Dec%202019%2C%20Fabrice,prime%20above%20RSA%2D240)." w:history="1">
         <w:r>
           <w:rPr>
             <w:rStyle w:val="Hyperlink"/>
@@ -20971,18 +21165,14 @@
           <w:t>Discrete logarithm records - Wikipedia</w:t>
         </w:r>
       </w:hyperlink>
-      <w:r>
-        <w:rPr>
-          <w:color w:val="000000"/>
-          <w:sz w:val="22"/>
-          <w:szCs w:val="22"/>
-        </w:rPr>
-        <w:t xml:space="preserve"> se poate trece pe 2048 dar curbe eliptice ar fi mai rapid</w:t>
-      </w:r>
     </w:p>
     <w:p>
       <w:pPr>
         <w:widowControl/>
+        <w:numPr>
+          <w:ilvl w:val="0"/>
+          <w:numId w:val="1"/>
+        </w:numPr>
         <w:pBdr>
           <w:top w:val="nil"/>
           <w:left w:val="nil"/>
@@ -21002,13 +21192,205 @@
         </w:rPr>
       </w:pPr>
       <w:r>
+        <w:t xml:space="preserve">Logjam </w:t>
+      </w:r>
+      <w:hyperlink r:id="rId21" w:history="1">
+        <w:r>
+          <w:rPr>
+            <w:rStyle w:val="Hyperlink"/>
+          </w:rPr>
+          <w:t>Weak Diffie-Hellman and the Logjam Attack</w:t>
+        </w:r>
+      </w:hyperlink>
+    </w:p>
+    <w:p>
+      <w:pPr>
+        <w:widowControl/>
+        <w:numPr>
+          <w:ilvl w:val="0"/>
+          <w:numId w:val="1"/>
+        </w:numPr>
+        <w:pBdr>
+          <w:top w:val="nil"/>
+          <w:left w:val="nil"/>
+          <w:bottom w:val="nil"/>
+          <w:right w:val="nil"/>
+          <w:between w:val="nil"/>
+        </w:pBdr>
+        <w:tabs>
+          <w:tab w:val="left" w:pos="450"/>
+        </w:tabs>
+        <w:spacing w:after="50"/>
+        <w:jc w:val="both"/>
         <w:rPr>
           <w:color w:val="000000"/>
           <w:sz w:val="22"/>
           <w:szCs w:val="22"/>
         </w:rPr>
-        <w:t>Dar avand in vedere cat de repede avanseaza tehnologia un CRQC ar putea sparge 2048 si ar fi nevoie de o trecere la PQC</w:t>
-      </w:r>
+      </w:pPr>
+      <w:r>
+        <w:t xml:space="preserve">Nist recomandation </w:t>
+      </w:r>
+      <w:hyperlink r:id="rId22" w:history="1">
+        <w:r>
+          <w:rPr>
+            <w:rStyle w:val="Hyperlink"/>
+          </w:rPr>
+          <w:t>SP 800-78-5, Cryptographic Algorithms and Key Sizes for Personal Identity Verification | CSRC</w:t>
+        </w:r>
+      </w:hyperlink>
+    </w:p>
+    <w:p>
+      <w:pPr>
+        <w:widowControl/>
+        <w:numPr>
+          <w:ilvl w:val="0"/>
+          <w:numId w:val="1"/>
+        </w:numPr>
+        <w:pBdr>
+          <w:top w:val="nil"/>
+          <w:left w:val="nil"/>
+          <w:bottom w:val="nil"/>
+          <w:right w:val="nil"/>
+          <w:between w:val="nil"/>
+        </w:pBdr>
+        <w:tabs>
+          <w:tab w:val="left" w:pos="450"/>
+        </w:tabs>
+        <w:spacing w:after="50"/>
+        <w:jc w:val="both"/>
+        <w:rPr>
+          <w:color w:val="000000"/>
+          <w:sz w:val="22"/>
+          <w:szCs w:val="22"/>
+        </w:rPr>
+      </w:pPr>
+      <w:hyperlink r:id="rId23" w:history="1">
+        <w:r>
+          <w:rPr>
+            <w:rStyle w:val="Hyperlink"/>
+            <w:sz w:val="22"/>
+            <w:szCs w:val="22"/>
+          </w:rPr>
+          <w:t>RFC 3526 - More Modular Exponential (MODP) Diffie-Hellman groups for Internet Key Exchange (IKE)</w:t>
+        </w:r>
+      </w:hyperlink>
+    </w:p>
+    <w:p>
+      <w:pPr>
+        <w:widowControl/>
+        <w:numPr>
+          <w:ilvl w:val="0"/>
+          <w:numId w:val="1"/>
+        </w:numPr>
+        <w:pBdr>
+          <w:top w:val="nil"/>
+          <w:left w:val="nil"/>
+          <w:bottom w:val="nil"/>
+          <w:right w:val="nil"/>
+          <w:between w:val="nil"/>
+        </w:pBdr>
+        <w:tabs>
+          <w:tab w:val="left" w:pos="450"/>
+        </w:tabs>
+        <w:spacing w:after="50"/>
+        <w:jc w:val="both"/>
+        <w:rPr>
+          <w:color w:val="000000"/>
+          <w:sz w:val="22"/>
+          <w:szCs w:val="22"/>
+        </w:rPr>
+      </w:pPr>
+      <w:hyperlink r:id="rId24" w:history="1">
+        <w:r>
+          <w:rPr>
+            <w:rStyle w:val="Hyperlink"/>
+            <w:sz w:val="22"/>
+            <w:szCs w:val="22"/>
+          </w:rPr>
+          <w:t>spake2 · PyPI</w:t>
+        </w:r>
+      </w:hyperlink>
+    </w:p>
+    <w:p>
+      <w:pPr>
+        <w:widowControl/>
+        <w:numPr>
+          <w:ilvl w:val="0"/>
+          <w:numId w:val="1"/>
+        </w:numPr>
+        <w:pBdr>
+          <w:top w:val="nil"/>
+          <w:left w:val="nil"/>
+          <w:bottom w:val="nil"/>
+          <w:right w:val="nil"/>
+          <w:between w:val="nil"/>
+        </w:pBdr>
+        <w:tabs>
+          <w:tab w:val="left" w:pos="450"/>
+        </w:tabs>
+        <w:spacing w:after="50"/>
+        <w:jc w:val="both"/>
+        <w:rPr>
+          <w:color w:val="000000"/>
+          <w:sz w:val="22"/>
+          <w:szCs w:val="22"/>
+        </w:rPr>
+      </w:pPr>
+      <w:hyperlink r:id="rId25" w:history="1">
+        <w:r>
+          <w:rPr>
+            <w:rStyle w:val="Hyperlink"/>
+            <w:sz w:val="22"/>
+            <w:szCs w:val="22"/>
+          </w:rPr>
+          <w:t>srp · PyPI</w:t>
+        </w:r>
+      </w:hyperlink>
+    </w:p>
+    <w:p>
+      <w:pPr>
+        <w:widowControl/>
+        <w:pBdr>
+          <w:top w:val="nil"/>
+          <w:left w:val="nil"/>
+          <w:bottom w:val="nil"/>
+          <w:right w:val="nil"/>
+          <w:between w:val="nil"/>
+        </w:pBdr>
+        <w:tabs>
+          <w:tab w:val="left" w:pos="450"/>
+        </w:tabs>
+        <w:spacing w:after="50"/>
+        <w:jc w:val="both"/>
+        <w:rPr>
+          <w:color w:val="000000"/>
+          <w:sz w:val="22"/>
+          <w:szCs w:val="22"/>
+        </w:rPr>
+      </w:pPr>
+    </w:p>
+    <w:p>
+      <w:pPr>
+        <w:widowControl/>
+        <w:pBdr>
+          <w:top w:val="nil"/>
+          <w:left w:val="nil"/>
+          <w:bottom w:val="nil"/>
+          <w:right w:val="nil"/>
+          <w:between w:val="nil"/>
+        </w:pBdr>
+        <w:tabs>
+          <w:tab w:val="left" w:pos="450"/>
+        </w:tabs>
+        <w:spacing w:after="50"/>
+        <w:jc w:val="both"/>
+        <w:rPr>
+          <w:color w:val="000000"/>
+          <w:sz w:val="22"/>
+          <w:szCs w:val="22"/>
+        </w:rPr>
+      </w:pPr>
     </w:p>
     <w:p>
       <w:pPr>
@@ -21591,7 +21973,7 @@
           <w:color w:val="000000"/>
         </w:rPr>
         <w:sectPr>
-          <w:footerReference w:type="default" r:id="rId20"/>
+          <w:footerReference w:type="default" r:id="rId26"/>
           <w:type w:val="continuous"/>
           <w:pgSz w:w="11906" w:h="16838" w:code="9"/>
           <w:pgMar w:top="1699" w:right="1138" w:bottom="1699" w:left="1411" w:header="1138" w:footer="1138" w:gutter="0"/>
@@ -21633,7 +22015,7 @@
       </w:pPr>
     </w:p>
     <w:sectPr>
-      <w:footerReference w:type="even" r:id="rId21"/>
+      <w:footerReference w:type="even" r:id="rId27"/>
       <w:type w:val="continuous"/>
       <w:pgSz w:w="11906" w:h="16838" w:code="9"/>
       <w:pgMar w:top="1699" w:right="1138" w:bottom="1699" w:left="1411" w:header="1138" w:footer="1138" w:gutter="0"/>
@@ -23862,7 +24244,7 @@
   <w:style w:type="paragraph" w:default="1" w:styleId="Normal">
     <w:name w:val="Normal"/>
     <w:qFormat/>
-    <w:rsid w:val="005F1D52"/>
+    <w:rsid w:val="008F1318"/>
   </w:style>
   <w:style w:type="paragraph" w:styleId="Heading1">
     <w:name w:val="heading 1"/>

</xml_diff>